<commit_message>
add equations to HPS, WSLOA and PV
</commit_message>
<xml_diff>
--- a/Template Project Report (eng).docx
+++ b/Template Project Report (eng).docx
@@ -578,7 +578,43 @@
           <w:rtl/>
           <w:lang w:val="en-US"/>
         </w:rPr>
-        <w:t>ספר הפרויקט לא יכלול את קטעי הקוד ,דפי נתונים וכו'. במידה ויש התייחסות ספציפית בספר הפרויקט לחלק מהקוד או דפי הנתונים וכו', ניתן לצרף את החומר הרלוונטי בלבד וכנספח לספר הפרויקט.</w:t>
+        <w:t xml:space="preserve">ספר הפרויקט לא יכלול את קטעי הקוד ,דפי נתונים </w:t>
+      </w:r>
+      <w:proofErr w:type="spellStart"/>
+      <w:r>
+        <w:rPr>
+          <w:rFonts w:ascii="Times New Roman" w:hAnsi="Times New Roman" w:cs="Times New Roman" w:hint="cs"/>
+          <w:rtl/>
+          <w:lang w:val="en-US"/>
+        </w:rPr>
+        <w:t>וכו</w:t>
+      </w:r>
+      <w:proofErr w:type="spellEnd"/>
+      <w:r>
+        <w:rPr>
+          <w:rFonts w:ascii="Times New Roman" w:hAnsi="Times New Roman" w:cs="Times New Roman" w:hint="cs"/>
+          <w:rtl/>
+          <w:lang w:val="en-US"/>
+        </w:rPr>
+        <w:t xml:space="preserve">'. במידה ויש התייחסות ספציפית בספר הפרויקט לחלק מהקוד או דפי הנתונים </w:t>
+      </w:r>
+      <w:proofErr w:type="spellStart"/>
+      <w:r>
+        <w:rPr>
+          <w:rFonts w:ascii="Times New Roman" w:hAnsi="Times New Roman" w:cs="Times New Roman" w:hint="cs"/>
+          <w:rtl/>
+          <w:lang w:val="en-US"/>
+        </w:rPr>
+        <w:t>וכו</w:t>
+      </w:r>
+      <w:proofErr w:type="spellEnd"/>
+      <w:r>
+        <w:rPr>
+          <w:rFonts w:ascii="Times New Roman" w:hAnsi="Times New Roman" w:cs="Times New Roman" w:hint="cs"/>
+          <w:rtl/>
+          <w:lang w:val="en-US"/>
+        </w:rPr>
+        <w:t>', ניתן לצרף את החומר הרלוונטי בלבד וכנספח לספר הפרויקט.</w:t>
       </w:r>
     </w:p>
     <w:p>
@@ -715,6 +751,7 @@
                 <w:rtl/>
               </w:rPr>
             </w:pPr>
+            <w:proofErr w:type="spellStart"/>
             <w:r>
               <w:rPr>
                 <w:b/>
@@ -724,6 +761,7 @@
               </w:rPr>
               <w:t>SyncRun</w:t>
             </w:r>
+            <w:proofErr w:type="spellEnd"/>
           </w:p>
         </w:tc>
       </w:tr>
@@ -1784,29 +1822,7 @@
                 <w:szCs w:val="24"/>
                 <w:lang w:eastAsia="he-IL" w:bidi="he-IL"/>
               </w:rPr>
-              <w:t>Simula</w:t>
-            </w:r>
-            <w:r>
-              <w:rPr>
-                <w:rStyle w:val="Hyperlink"/>
-                <w:rFonts w:asciiTheme="minorBidi" w:hAnsiTheme="minorBidi" w:cstheme="minorBidi"/>
-                <w:noProof/>
-                <w:sz w:val="24"/>
-                <w:szCs w:val="24"/>
-                <w:lang w:eastAsia="he-IL" w:bidi="he-IL"/>
-              </w:rPr>
-              <w:t>t</w:t>
-            </w:r>
-            <w:r>
-              <w:rPr>
-                <w:rStyle w:val="Hyperlink"/>
-                <w:rFonts w:asciiTheme="minorBidi" w:hAnsiTheme="minorBidi" w:cstheme="minorBidi"/>
-                <w:noProof/>
-                <w:sz w:val="24"/>
-                <w:szCs w:val="24"/>
-                <w:lang w:eastAsia="he-IL" w:bidi="he-IL"/>
-              </w:rPr>
-              <w:t>ion..</w:t>
+              <w:t>Simulation..</w:t>
             </w:r>
             <w:r>
               <w:rPr>
@@ -4262,10 +4278,10 @@
             <v:path o:extrusionok="f" gradientshapeok="t" o:connecttype="rect"/>
             <o:lock v:ext="edit" aspectratio="t"/>
           </v:shapetype>
-          <v:shape id="_x0000_i1025" type="#_x0000_t75" style="width:5in;height:270.8pt" o:ole="">
+          <v:shape id="_x0000_i1025" type="#_x0000_t75" style="width:5in;height:270.6pt" o:ole="">
             <v:imagedata r:id="rId9" o:title=""/>
           </v:shape>
-          <o:OLEObject Type="Embed" ProgID="PowerPoint.Slide.12" ShapeID="_x0000_i1025" DrawAspect="Content" ObjectID="_1845901096" r:id="rId10"/>
+          <o:OLEObject Type="Embed" ProgID="PowerPoint.Slide.12" ShapeID="_x0000_i1025" DrawAspect="Content" ObjectID="_1846065765" r:id="rId10"/>
         </w:object>
       </w:r>
     </w:p>
@@ -4390,7 +4406,35 @@
         <w:rPr>
           <w:lang w:val="en-IL"/>
         </w:rPr>
-        <w:t xml:space="preserve">The integration of music into athletic training has become increasingly popular, as rhythm and tempo can significantly enhance a runner's motivation, improve physical coordination, and provide a smoother running experience. However, traditional music playback applications typically offer a fixed tempo or rely on manual speed adjustments, which fail to adapt to the fluctuating pace of a runner throughout a specific workout. In reality, the natural beats per minute (BPM) of most standard songs are slower than an average runner's cadence. This limitation creates a gap at the intersection of musical digital signal processing (DSP) and sports applications, presenting an opportunity for a system capable of analyzing a user's planned or recorded physical rhythm and seamlessly adjusting the audio stream beforehand to match it. </w:t>
+        <w:t xml:space="preserve">The integration of music into athletic training has become increasingly popular, as rhythm and tempo can significantly enhance a runner's motivation, improve physical coordination, and provide a smoother running experience. However, traditional music playback applications typically offer a fixed tempo or rely on manual speed adjustments, which fail to adapt to the fluctuating pace of a runner throughout a specific workout. </w:t>
+      </w:r>
+      <w:proofErr w:type="gramStart"/>
+      <w:r>
+        <w:rPr>
+          <w:lang w:val="en-IL"/>
+        </w:rPr>
+        <w:t>In reality, the</w:t>
+      </w:r>
+      <w:proofErr w:type="gramEnd"/>
+      <w:r>
+        <w:rPr>
+          <w:lang w:val="en-IL"/>
+        </w:rPr>
+        <w:t xml:space="preserve"> natural beats per minute (BPM) of most standard songs are slower than an average runner's cadence. This limitation creates a gap at the intersection of musical digital signal processing (DSP) and sports applications, presenting an opportunity for a system capable of </w:t>
+      </w:r>
+      <w:proofErr w:type="spellStart"/>
+      <w:r>
+        <w:rPr>
+          <w:lang w:val="en-IL"/>
+        </w:rPr>
+        <w:t>analyzing</w:t>
+      </w:r>
+      <w:proofErr w:type="spellEnd"/>
+      <w:r>
+        <w:rPr>
+          <w:lang w:val="en-IL"/>
+        </w:rPr>
+        <w:t xml:space="preserve"> a user's planned or recorded physical rhythm and seamlessly adjusting the audio stream beforehand to match it. </w:t>
       </w:r>
     </w:p>
     <w:p>
@@ -4433,7 +4477,21 @@
         <w:rPr>
           <w:lang w:val="en-IL"/>
         </w:rPr>
-        <w:t xml:space="preserve">The core objective of this project, "SyncRun – Align Music to Run" (Project 3408), is to design and implement a software system capable of adjusting the playback rate of a rhythmic music track to match the offline physiological metrics (step rhythm) of a runner. Using a fully pre-determined runner step signal, the system processes the audio prior to playback, calculating an optimal speed-up or speed-down ratio for each specific segment of the run one time beforehand. The goal is to synchronize the timing of the music's beats with the runner's steps using time-stretch algorithms, improving flow and motivation without altering the song's original pitch or introducing unnatural audio distortions. </w:t>
+        <w:t>The core objective of this project, "</w:t>
+      </w:r>
+      <w:proofErr w:type="spellStart"/>
+      <w:r>
+        <w:rPr>
+          <w:lang w:val="en-IL"/>
+        </w:rPr>
+        <w:t>SyncRun</w:t>
+      </w:r>
+      <w:proofErr w:type="spellEnd"/>
+      <w:r>
+        <w:rPr>
+          <w:lang w:val="en-IL"/>
+        </w:rPr>
+        <w:t xml:space="preserve"> – Align Music to Run" (Project 3408), is to design and implement a software system capable of adjusting the playback rate of a rhythmic music track to match the offline physiological metrics (step rhythm) of a runner. Using a fully pre-determined runner step signal, the system processes the audio prior to playback, calculating an optimal speed-up or speed-down ratio for each specific segment of the run one time beforehand. The goal is to synchronize the timing of the music's beats with the runner's steps using time-stretch algorithms, improving flow and motivation without altering the song's original pitch or introducing unnatural audio distortions. </w:t>
       </w:r>
     </w:p>
     <w:p>
@@ -4504,6 +4562,7 @@
         <w:rPr>
           <w:lang w:val="en-IL"/>
         </w:rPr>
+        <w:lastRenderedPageBreak/>
         <w:t xml:space="preserve">To solve the offline synchronization problem, the system employs a multi-step digital signal processing pipeline implemented in Python. The approach is broken down into the following stages: </w:t>
       </w:r>
     </w:p>
@@ -4533,7 +4592,35 @@
         <w:rPr>
           <w:lang w:val="en-IL"/>
         </w:rPr>
-        <w:t xml:space="preserve"> The librosa library is used to analyze the song offline, determining the beat timestamps and overall tempo (BPM). </w:t>
+        <w:t xml:space="preserve"> The </w:t>
+      </w:r>
+      <w:proofErr w:type="spellStart"/>
+      <w:r>
+        <w:rPr>
+          <w:lang w:val="en-IL"/>
+        </w:rPr>
+        <w:t>librosa</w:t>
+      </w:r>
+      <w:proofErr w:type="spellEnd"/>
+      <w:r>
+        <w:rPr>
+          <w:lang w:val="en-IL"/>
+        </w:rPr>
+        <w:t xml:space="preserve"> library is used to </w:t>
+      </w:r>
+      <w:proofErr w:type="spellStart"/>
+      <w:r>
+        <w:rPr>
+          <w:lang w:val="en-IL"/>
+        </w:rPr>
+        <w:t>analyze</w:t>
+      </w:r>
+      <w:proofErr w:type="spellEnd"/>
+      <w:r>
+        <w:rPr>
+          <w:lang w:val="en-IL"/>
+        </w:rPr>
+        <w:t xml:space="preserve"> the song offline, determining the beat timestamps and overall tempo (BPM). </w:t>
       </w:r>
     </w:p>
     <w:p>
@@ -4714,7 +4801,14 @@
         <w:rPr>
           <w:lang w:val="en-IL"/>
         </w:rPr>
-        <w:t xml:space="preserve"> Conventional fitness music applications (such as Spotify Running) generally rely on pre-set tempo playlists or basic manual speed adjustments, which offer limited adaptability. Other alternatives utilize metronome-based synchronization, which provides fixed rhythmic cues but lacks the natural, motivating experience of music. In contrast, this project offers precise, mathematical beat-to-step alignment mapped directly to a runner's specific workout routine. </w:t>
+        <w:t xml:space="preserve"> Conventional fitness music applications (such as Spotify Running) generally rely on pre-set tempo playlists or basic manual speed adjustments, which offer limited adaptability. Other alternatives utilize metronome-based synchronization, which provides fixed rhythmic cues but lacks the natural, motivating experience of music. In contrast, this project offers </w:t>
+      </w:r>
+      <w:r>
+        <w:rPr>
+          <w:lang w:val="en-IL"/>
+        </w:rPr>
+        <w:lastRenderedPageBreak/>
+        <w:t xml:space="preserve">precise, mathematical beat-to-step alignment mapped directly to a runner's specific workout routine. </w:t>
       </w:r>
     </w:p>
     <w:p>
@@ -4833,7 +4927,27 @@
           <w:highlight w:val="yellow"/>
           <w:lang w:val="en-IL"/>
         </w:rPr>
-        <w:t>[Insert a table here summarizing the quantitative performance metrics and criteria results (e.g., Average Beat Alignment Error: ~15.67 ms, Total Elapsed Processing Time: ~38.47 sec)]</w:t>
+        <w:t xml:space="preserve">[Insert a table here summarizing the quantitative performance metrics and criteria results (e.g., Average Beat Alignment Error: ~15.67 </w:t>
+      </w:r>
+      <w:proofErr w:type="spellStart"/>
+      <w:r>
+        <w:rPr>
+          <w:b/>
+          <w:bCs/>
+          <w:highlight w:val="yellow"/>
+          <w:lang w:val="en-IL"/>
+        </w:rPr>
+        <w:t>ms</w:t>
+      </w:r>
+      <w:proofErr w:type="spellEnd"/>
+      <w:r>
+        <w:rPr>
+          <w:b/>
+          <w:bCs/>
+          <w:highlight w:val="yellow"/>
+          <w:lang w:val="en-IL"/>
+        </w:rPr>
+        <w:t>, Total Elapsed Processing Time: ~38.47 sec)]</w:t>
       </w:r>
     </w:p>
     <w:p/>
@@ -4843,6 +4957,7 @@
       </w:pPr>
       <w:bookmarkStart w:id="6" w:name="_Toc135313528"/>
       <w:r>
+        <w:lastRenderedPageBreak/>
         <w:t>Theoretical background</w:t>
       </w:r>
       <w:bookmarkEnd w:id="6"/>
@@ -5664,7 +5779,27 @@
           <w:bdr w:val="none" w:sz="0" w:space="0" w:color="auto" w:frame="1"/>
           <w:lang w:val="en-IL" w:eastAsia="en-IL"/>
         </w:rPr>
-        <w:t>To analyze and manipulate the frequency content of the audio over time, the system transforms the time-domain audio signal into a time-frequency representation using the Short-Time Fourier Transform (STFT). This transformation serves as the fundamental basis for both the subsequent separation and frequency-domain stretching stages.</w:t>
+        <w:t xml:space="preserve">To </w:t>
+      </w:r>
+      <w:proofErr w:type="spellStart"/>
+      <w:r>
+        <w:rPr>
+          <w:rFonts w:ascii="Arial" w:hAnsi="Arial" w:cs="Arial"/>
+          <w:color w:val="1F1F1F"/>
+          <w:bdr w:val="none" w:sz="0" w:space="0" w:color="auto" w:frame="1"/>
+          <w:lang w:val="en-IL" w:eastAsia="en-IL"/>
+        </w:rPr>
+        <w:t>analyze</w:t>
+      </w:r>
+      <w:proofErr w:type="spellEnd"/>
+      <w:r>
+        <w:rPr>
+          <w:rFonts w:ascii="Arial" w:hAnsi="Arial" w:cs="Arial"/>
+          <w:color w:val="1F1F1F"/>
+          <w:bdr w:val="none" w:sz="0" w:space="0" w:color="auto" w:frame="1"/>
+          <w:lang w:val="en-IL" w:eastAsia="en-IL"/>
+        </w:rPr>
+        <w:t xml:space="preserve"> and manipulate the frequency content of the audio over time, the system transforms the time-domain audio signal into a time-frequency representation using the Short-Time Fourier Transform (STFT). This transformation serves as the fundamental basis for both the subsequent separation and frequency-domain stretching stages.</w:t>
       </w:r>
       <w:r>
         <w:rPr>
@@ -5821,6 +5956,7 @@
               <w:color w:val="1F1F1F"/>
               <w:lang w:val="en-IL" w:eastAsia="en-IL"/>
             </w:rPr>
+            <w:lastRenderedPageBreak/>
             <m:t>X</m:t>
           </m:r>
           <m:d>
@@ -6342,6 +6478,642 @@
     </w:p>
     <w:p>
       <w:pPr>
+        <w:pStyle w:val="ListParagraph"/>
+        <w:numPr>
+          <w:ilvl w:val="0"/>
+          <w:numId w:val="14"/>
+        </w:numPr>
+        <w:spacing w:after="100" w:afterAutospacing="1" w:line="240" w:lineRule="auto"/>
+        <w:rPr>
+          <w:rFonts w:ascii="Arial" w:hAnsi="Arial" w:cs="Arial"/>
+          <w:lang w:val="en-IL" w:eastAsia="en-IL"/>
+        </w:rPr>
+      </w:pPr>
+      <w:r>
+        <w:rPr>
+          <w:rFonts w:ascii="Arial" w:hAnsi="Arial" w:cs="Arial"/>
+          <w:b/>
+          <w:bCs/>
+          <w:lang w:val="en-IL" w:eastAsia="en-IL"/>
+        </w:rPr>
+        <w:t xml:space="preserve"> Mathematical Definition:</w:t>
+      </w:r>
+      <w:r>
+        <w:rPr>
+          <w:rFonts w:ascii="Arial" w:hAnsi="Arial" w:cs="Arial"/>
+          <w:lang w:val="en-IL" w:eastAsia="en-IL"/>
+        </w:rPr>
+        <w:t xml:space="preserve"> The Harmonic-Percussive Source Separation (HPSS) masks are calculated as follows:</w:t>
+      </w:r>
+    </w:p>
+    <w:p>
+      <w:pPr>
+        <w:spacing w:line="240" w:lineRule="auto"/>
+        <w:ind w:left="360"/>
+        <w:rPr>
+          <w:rFonts w:ascii="Arial" w:hAnsi="Arial" w:cs="Arial"/>
+          <w:lang w:val="en-IL" w:eastAsia="en-IL"/>
+        </w:rPr>
+      </w:pPr>
+      <m:oMathPara>
+        <m:oMath>
+          <m:sSub>
+            <m:sSubPr>
+              <m:ctrlPr>
+                <w:rPr>
+                  <w:rFonts w:ascii="Cambria Math" w:hAnsi="Cambria Math" w:cs="Arial"/>
+                  <w:lang w:val="en-IL" w:eastAsia="en-IL"/>
+                </w:rPr>
+              </m:ctrlPr>
+            </m:sSubPr>
+            <m:e>
+              <m:r>
+                <w:rPr>
+                  <w:rFonts w:ascii="Cambria Math" w:hAnsi="Cambria Math" w:cs="Arial"/>
+                  <w:lang w:val="en-IL" w:eastAsia="en-IL"/>
+                </w:rPr>
+                <m:t>M</m:t>
+              </m:r>
+            </m:e>
+            <m:sub>
+              <m:r>
+                <w:rPr>
+                  <w:rFonts w:ascii="Cambria Math" w:hAnsi="Cambria Math" w:cs="Arial"/>
+                  <w:lang w:val="en-IL" w:eastAsia="en-IL"/>
+                </w:rPr>
+                <m:t>harm</m:t>
+              </m:r>
+            </m:sub>
+          </m:sSub>
+          <m:r>
+            <w:rPr>
+              <w:rFonts w:ascii="Cambria Math" w:hAnsi="Cambria Math" w:cs="Arial"/>
+              <w:lang w:val="en-IL" w:eastAsia="en-IL"/>
+            </w:rPr>
+            <m:t>=</m:t>
+          </m:r>
+          <m:f>
+            <m:fPr>
+              <m:ctrlPr>
+                <w:rPr>
+                  <w:rFonts w:ascii="Cambria Math" w:hAnsi="Cambria Math" w:cs="Arial"/>
+                  <w:lang w:val="en-IL" w:eastAsia="en-IL"/>
+                </w:rPr>
+              </m:ctrlPr>
+            </m:fPr>
+            <m:num>
+              <m:sSubSup>
+                <m:sSubSupPr>
+                  <m:ctrlPr>
+                    <w:rPr>
+                      <w:rFonts w:ascii="Cambria Math" w:hAnsi="Cambria Math" w:cs="Arial"/>
+                      <w:lang w:val="en-IL" w:eastAsia="en-IL"/>
+                    </w:rPr>
+                  </m:ctrlPr>
+                </m:sSubSupPr>
+                <m:e>
+                  <m:r>
+                    <w:rPr>
+                      <w:rFonts w:ascii="Cambria Math" w:hAnsi="Cambria Math" w:cs="Arial"/>
+                      <w:lang w:val="en-IL" w:eastAsia="en-IL"/>
+                    </w:rPr>
+                    <m:t>H</m:t>
+                  </m:r>
+                </m:e>
+                <m:sub>
+                  <m:r>
+                    <w:rPr>
+                      <w:rFonts w:ascii="Cambria Math" w:hAnsi="Cambria Math" w:cs="Arial"/>
+                      <w:lang w:val="en-IL" w:eastAsia="en-IL"/>
+                    </w:rPr>
+                    <m:t>smooth</m:t>
+                  </m:r>
+                </m:sub>
+                <m:sup>
+                  <m:r>
+                    <w:rPr>
+                      <w:rFonts w:ascii="Cambria Math" w:hAnsi="Cambria Math" w:cs="Arial"/>
+                      <w:lang w:val="en-IL" w:eastAsia="en-IL"/>
+                    </w:rPr>
+                    <m:t>power</m:t>
+                  </m:r>
+                </m:sup>
+              </m:sSubSup>
+            </m:num>
+            <m:den>
+              <m:sSubSup>
+                <m:sSubSupPr>
+                  <m:ctrlPr>
+                    <w:rPr>
+                      <w:rFonts w:ascii="Cambria Math" w:hAnsi="Cambria Math" w:cs="Arial"/>
+                      <w:lang w:val="en-IL" w:eastAsia="en-IL"/>
+                    </w:rPr>
+                  </m:ctrlPr>
+                </m:sSubSupPr>
+                <m:e>
+                  <m:r>
+                    <w:rPr>
+                      <w:rFonts w:ascii="Cambria Math" w:hAnsi="Cambria Math" w:cs="Arial"/>
+                      <w:lang w:val="en-IL" w:eastAsia="en-IL"/>
+                    </w:rPr>
+                    <m:t>H</m:t>
+                  </m:r>
+                </m:e>
+                <m:sub>
+                  <m:r>
+                    <w:rPr>
+                      <w:rFonts w:ascii="Cambria Math" w:hAnsi="Cambria Math" w:cs="Arial"/>
+                      <w:lang w:val="en-IL" w:eastAsia="en-IL"/>
+                    </w:rPr>
+                    <m:t>smooth</m:t>
+                  </m:r>
+                </m:sub>
+                <m:sup>
+                  <m:r>
+                    <w:rPr>
+                      <w:rFonts w:ascii="Cambria Math" w:hAnsi="Cambria Math" w:cs="Arial"/>
+                      <w:lang w:val="en-IL" w:eastAsia="en-IL"/>
+                    </w:rPr>
+                    <m:t>power</m:t>
+                  </m:r>
+                </m:sup>
+              </m:sSubSup>
+              <m:r>
+                <w:rPr>
+                  <w:rFonts w:ascii="Cambria Math" w:hAnsi="Cambria Math" w:cs="Arial"/>
+                  <w:lang w:val="en-IL" w:eastAsia="en-IL"/>
+                </w:rPr>
+                <m:t>+</m:t>
+              </m:r>
+              <m:sSup>
+                <m:sSupPr>
+                  <m:ctrlPr>
+                    <w:rPr>
+                      <w:rFonts w:ascii="Cambria Math" w:hAnsi="Cambria Math" w:cs="Arial"/>
+                      <w:lang w:val="en-IL" w:eastAsia="en-IL"/>
+                    </w:rPr>
+                  </m:ctrlPr>
+                </m:sSupPr>
+                <m:e>
+                  <m:d>
+                    <m:dPr>
+                      <m:ctrlPr>
+                        <w:rPr>
+                          <w:rFonts w:ascii="Cambria Math" w:hAnsi="Cambria Math" w:cs="Arial"/>
+                          <w:lang w:val="en-IL" w:eastAsia="en-IL"/>
+                        </w:rPr>
+                      </m:ctrlPr>
+                    </m:dPr>
+                    <m:e>
+                      <m:r>
+                        <w:rPr>
+                          <w:rFonts w:ascii="Cambria Math" w:hAnsi="Cambria Math" w:cs="Arial"/>
+                          <w:lang w:val="en-IL" w:eastAsia="en-IL"/>
+                        </w:rPr>
+                        <m:t>margin⋅</m:t>
+                      </m:r>
+                      <m:sSub>
+                        <m:sSubPr>
+                          <m:ctrlPr>
+                            <w:rPr>
+                              <w:rFonts w:ascii="Cambria Math" w:hAnsi="Cambria Math" w:cs="Arial"/>
+                              <w:lang w:val="en-IL" w:eastAsia="en-IL"/>
+                            </w:rPr>
+                          </m:ctrlPr>
+                        </m:sSubPr>
+                        <m:e>
+                          <m:r>
+                            <w:rPr>
+                              <w:rFonts w:ascii="Cambria Math" w:hAnsi="Cambria Math" w:cs="Arial"/>
+                              <w:lang w:val="en-IL" w:eastAsia="en-IL"/>
+                            </w:rPr>
+                            <m:t>P</m:t>
+                          </m:r>
+                        </m:e>
+                        <m:sub>
+                          <m:r>
+                            <w:rPr>
+                              <w:rFonts w:ascii="Cambria Math" w:hAnsi="Cambria Math" w:cs="Arial"/>
+                              <w:lang w:val="en-IL" w:eastAsia="en-IL"/>
+                            </w:rPr>
+                            <m:t>smooth</m:t>
+                          </m:r>
+                        </m:sub>
+                      </m:sSub>
+                    </m:e>
+                  </m:d>
+                </m:e>
+                <m:sup>
+                  <m:r>
+                    <w:rPr>
+                      <w:rFonts w:ascii="Cambria Math" w:hAnsi="Cambria Math" w:cs="Arial"/>
+                      <w:lang w:val="en-IL" w:eastAsia="en-IL"/>
+                    </w:rPr>
+                    <m:t>power</m:t>
+                  </m:r>
+                </m:sup>
+              </m:sSup>
+              <m:r>
+                <w:rPr>
+                  <w:rFonts w:ascii="Cambria Math" w:hAnsi="Cambria Math" w:cs="Arial"/>
+                  <w:lang w:val="en-IL" w:eastAsia="en-IL"/>
+                </w:rPr>
+                <m:t>+ϵ</m:t>
+              </m:r>
+            </m:den>
+          </m:f>
+        </m:oMath>
+      </m:oMathPara>
+    </w:p>
+    <w:p>
+      <w:pPr>
+        <w:pStyle w:val="ListParagraph"/>
+        <w:spacing w:line="240" w:lineRule="auto"/>
+        <w:rPr>
+          <w:rFonts w:ascii="Arial" w:hAnsi="Arial" w:cs="Arial"/>
+          <w:lang w:val="en-IL" w:eastAsia="en-IL"/>
+        </w:rPr>
+      </w:pPr>
+      <m:oMathPara>
+        <m:oMath>
+          <m:sSub>
+            <m:sSubPr>
+              <m:ctrlPr>
+                <w:rPr>
+                  <w:rFonts w:ascii="Cambria Math" w:hAnsi="Cambria Math" w:cs="Arial"/>
+                  <w:lang w:val="en-IL" w:eastAsia="en-IL"/>
+                </w:rPr>
+              </m:ctrlPr>
+            </m:sSubPr>
+            <m:e>
+              <m:r>
+                <w:rPr>
+                  <w:rFonts w:ascii="Cambria Math" w:hAnsi="Cambria Math" w:cs="Arial"/>
+                  <w:lang w:val="en-IL" w:eastAsia="en-IL"/>
+                </w:rPr>
+                <m:t>M</m:t>
+              </m:r>
+            </m:e>
+            <m:sub>
+              <m:r>
+                <w:rPr>
+                  <w:rFonts w:ascii="Cambria Math" w:hAnsi="Cambria Math" w:cs="Arial"/>
+                  <w:lang w:val="en-IL" w:eastAsia="en-IL"/>
+                </w:rPr>
+                <m:t>perc</m:t>
+              </m:r>
+            </m:sub>
+          </m:sSub>
+          <m:r>
+            <w:rPr>
+              <w:rFonts w:ascii="Cambria Math" w:hAnsi="Cambria Math" w:cs="Arial"/>
+              <w:lang w:val="en-IL" w:eastAsia="en-IL"/>
+            </w:rPr>
+            <m:t>=</m:t>
+          </m:r>
+          <m:f>
+            <m:fPr>
+              <m:ctrlPr>
+                <w:rPr>
+                  <w:rFonts w:ascii="Cambria Math" w:hAnsi="Cambria Math" w:cs="Arial"/>
+                  <w:lang w:val="en-IL" w:eastAsia="en-IL"/>
+                </w:rPr>
+              </m:ctrlPr>
+            </m:fPr>
+            <m:num>
+              <m:sSubSup>
+                <m:sSubSupPr>
+                  <m:ctrlPr>
+                    <w:rPr>
+                      <w:rFonts w:ascii="Cambria Math" w:hAnsi="Cambria Math" w:cs="Arial"/>
+                      <w:lang w:val="en-IL" w:eastAsia="en-IL"/>
+                    </w:rPr>
+                  </m:ctrlPr>
+                </m:sSubSupPr>
+                <m:e>
+                  <m:r>
+                    <w:rPr>
+                      <w:rFonts w:ascii="Cambria Math" w:hAnsi="Cambria Math" w:cs="Arial"/>
+                      <w:lang w:val="en-IL" w:eastAsia="en-IL"/>
+                    </w:rPr>
+                    <m:t>P</m:t>
+                  </m:r>
+                </m:e>
+                <m:sub>
+                  <m:r>
+                    <w:rPr>
+                      <w:rFonts w:ascii="Cambria Math" w:hAnsi="Cambria Math" w:cs="Arial"/>
+                      <w:lang w:val="en-IL" w:eastAsia="en-IL"/>
+                    </w:rPr>
+                    <m:t>smooth</m:t>
+                  </m:r>
+                </m:sub>
+                <m:sup>
+                  <m:r>
+                    <w:rPr>
+                      <w:rFonts w:ascii="Cambria Math" w:hAnsi="Cambria Math" w:cs="Arial"/>
+                      <w:lang w:val="en-IL" w:eastAsia="en-IL"/>
+                    </w:rPr>
+                    <m:t>power</m:t>
+                  </m:r>
+                </m:sup>
+              </m:sSubSup>
+            </m:num>
+            <m:den>
+              <m:sSubSup>
+                <m:sSubSupPr>
+                  <m:ctrlPr>
+                    <w:rPr>
+                      <w:rFonts w:ascii="Cambria Math" w:hAnsi="Cambria Math" w:cs="Arial"/>
+                      <w:lang w:val="en-IL" w:eastAsia="en-IL"/>
+                    </w:rPr>
+                  </m:ctrlPr>
+                </m:sSubSupPr>
+                <m:e>
+                  <m:r>
+                    <w:rPr>
+                      <w:rFonts w:ascii="Cambria Math" w:hAnsi="Cambria Math" w:cs="Arial"/>
+                      <w:lang w:val="en-IL" w:eastAsia="en-IL"/>
+                    </w:rPr>
+                    <m:t>P</m:t>
+                  </m:r>
+                </m:e>
+                <m:sub>
+                  <m:r>
+                    <w:rPr>
+                      <w:rFonts w:ascii="Cambria Math" w:hAnsi="Cambria Math" w:cs="Arial"/>
+                      <w:lang w:val="en-IL" w:eastAsia="en-IL"/>
+                    </w:rPr>
+                    <m:t>smooth</m:t>
+                  </m:r>
+                </m:sub>
+                <m:sup>
+                  <m:r>
+                    <w:rPr>
+                      <w:rFonts w:ascii="Cambria Math" w:hAnsi="Cambria Math" w:cs="Arial"/>
+                      <w:lang w:val="en-IL" w:eastAsia="en-IL"/>
+                    </w:rPr>
+                    <m:t>power</m:t>
+                  </m:r>
+                </m:sup>
+              </m:sSubSup>
+              <m:r>
+                <w:rPr>
+                  <w:rFonts w:ascii="Cambria Math" w:hAnsi="Cambria Math" w:cs="Arial"/>
+                  <w:lang w:val="en-IL" w:eastAsia="en-IL"/>
+                </w:rPr>
+                <m:t>+</m:t>
+              </m:r>
+              <m:sSup>
+                <m:sSupPr>
+                  <m:ctrlPr>
+                    <w:rPr>
+                      <w:rFonts w:ascii="Cambria Math" w:hAnsi="Cambria Math" w:cs="Arial"/>
+                      <w:lang w:val="en-IL" w:eastAsia="en-IL"/>
+                    </w:rPr>
+                  </m:ctrlPr>
+                </m:sSupPr>
+                <m:e>
+                  <m:d>
+                    <m:dPr>
+                      <m:ctrlPr>
+                        <w:rPr>
+                          <w:rFonts w:ascii="Cambria Math" w:hAnsi="Cambria Math" w:cs="Arial"/>
+                          <w:lang w:val="en-IL" w:eastAsia="en-IL"/>
+                        </w:rPr>
+                      </m:ctrlPr>
+                    </m:dPr>
+                    <m:e>
+                      <m:r>
+                        <w:rPr>
+                          <w:rFonts w:ascii="Cambria Math" w:hAnsi="Cambria Math" w:cs="Arial"/>
+                          <w:lang w:val="en-IL" w:eastAsia="en-IL"/>
+                        </w:rPr>
+                        <m:t>margin⋅</m:t>
+                      </m:r>
+                      <m:sSub>
+                        <m:sSubPr>
+                          <m:ctrlPr>
+                            <w:rPr>
+                              <w:rFonts w:ascii="Cambria Math" w:hAnsi="Cambria Math" w:cs="Arial"/>
+                              <w:lang w:val="en-IL" w:eastAsia="en-IL"/>
+                            </w:rPr>
+                          </m:ctrlPr>
+                        </m:sSubPr>
+                        <m:e>
+                          <m:r>
+                            <w:rPr>
+                              <w:rFonts w:ascii="Cambria Math" w:hAnsi="Cambria Math" w:cs="Arial"/>
+                              <w:lang w:val="en-IL" w:eastAsia="en-IL"/>
+                            </w:rPr>
+                            <m:t>H</m:t>
+                          </m:r>
+                        </m:e>
+                        <m:sub>
+                          <m:r>
+                            <w:rPr>
+                              <w:rFonts w:ascii="Cambria Math" w:hAnsi="Cambria Math" w:cs="Arial"/>
+                              <w:lang w:val="en-IL" w:eastAsia="en-IL"/>
+                            </w:rPr>
+                            <m:t>smooth</m:t>
+                          </m:r>
+                        </m:sub>
+                      </m:sSub>
+                    </m:e>
+                  </m:d>
+                </m:e>
+                <m:sup>
+                  <m:r>
+                    <w:rPr>
+                      <w:rFonts w:ascii="Cambria Math" w:hAnsi="Cambria Math" w:cs="Arial"/>
+                      <w:lang w:val="en-IL" w:eastAsia="en-IL"/>
+                    </w:rPr>
+                    <m:t>power</m:t>
+                  </m:r>
+                </m:sup>
+              </m:sSup>
+              <m:r>
+                <w:rPr>
+                  <w:rFonts w:ascii="Cambria Math" w:hAnsi="Cambria Math" w:cs="Arial"/>
+                  <w:lang w:val="en-IL" w:eastAsia="en-IL"/>
+                </w:rPr>
+                <m:t>+ϵ</m:t>
+              </m:r>
+            </m:den>
+          </m:f>
+        </m:oMath>
+      </m:oMathPara>
+    </w:p>
+    <w:p>
+      <w:pPr>
+        <w:pStyle w:val="ListParagraph"/>
+        <w:spacing w:after="100" w:afterAutospacing="1" w:line="240" w:lineRule="auto"/>
+        <w:rPr>
+          <w:rFonts w:ascii="Arial" w:hAnsi="Arial" w:cs="Arial"/>
+          <w:lang w:val="en-IL" w:eastAsia="en-IL"/>
+        </w:rPr>
+      </w:pPr>
+      <w:r>
+        <w:rPr>
+          <w:rFonts w:ascii="Arial" w:hAnsi="Arial" w:cs="Arial"/>
+          <w:lang w:val="en-IL" w:eastAsia="en-IL"/>
+        </w:rPr>
+        <w:t xml:space="preserve">where </w:t>
+      </w:r>
+      <m:oMath>
+        <m:sSub>
+          <m:sSubPr>
+            <m:ctrlPr>
+              <w:rPr>
+                <w:rFonts w:ascii="Cambria Math" w:hAnsi="Cambria Math" w:cs="Arial"/>
+                <w:lang w:val="en-IL" w:eastAsia="en-IL"/>
+              </w:rPr>
+            </m:ctrlPr>
+          </m:sSubPr>
+          <m:e>
+            <m:r>
+              <w:rPr>
+                <w:rFonts w:ascii="Cambria Math" w:hAnsi="Cambria Math" w:cs="Arial"/>
+                <w:lang w:val="en-IL" w:eastAsia="en-IL"/>
+              </w:rPr>
+              <m:t>H</m:t>
+            </m:r>
+          </m:e>
+          <m:sub>
+            <m:r>
+              <w:rPr>
+                <w:rFonts w:ascii="Cambria Math" w:hAnsi="Cambria Math" w:cs="Arial"/>
+                <w:lang w:val="en-IL" w:eastAsia="en-IL"/>
+              </w:rPr>
+              <m:t>smooth</m:t>
+            </m:r>
+          </m:sub>
+        </m:sSub>
+      </m:oMath>
+      <w:r>
+        <w:rPr>
+          <w:rFonts w:ascii="Arial" w:hAnsi="Arial" w:cs="Arial"/>
+          <w:lang w:val="en-IL" w:eastAsia="en-IL"/>
+        </w:rPr>
+        <w:t xml:space="preserve"> is the magnitude spectrogram smoothed across the time axis, </w:t>
+      </w:r>
+      <m:oMath>
+        <m:sSub>
+          <m:sSubPr>
+            <m:ctrlPr>
+              <w:rPr>
+                <w:rFonts w:ascii="Cambria Math" w:hAnsi="Cambria Math" w:cs="Arial"/>
+                <w:lang w:val="en-IL" w:eastAsia="en-IL"/>
+              </w:rPr>
+            </m:ctrlPr>
+          </m:sSubPr>
+          <m:e>
+            <m:r>
+              <w:rPr>
+                <w:rFonts w:ascii="Cambria Math" w:hAnsi="Cambria Math" w:cs="Arial"/>
+                <w:lang w:val="en-IL" w:eastAsia="en-IL"/>
+              </w:rPr>
+              <m:t>P</m:t>
+            </m:r>
+          </m:e>
+          <m:sub>
+            <m:r>
+              <w:rPr>
+                <w:rFonts w:ascii="Cambria Math" w:hAnsi="Cambria Math" w:cs="Arial"/>
+                <w:lang w:val="en-IL" w:eastAsia="en-IL"/>
+              </w:rPr>
+              <m:t>smooth</m:t>
+            </m:r>
+          </m:sub>
+        </m:sSub>
+      </m:oMath>
+      <w:r>
+        <w:rPr>
+          <w:rFonts w:ascii="Arial" w:hAnsi="Arial" w:cs="Arial"/>
+          <w:lang w:val="en-IL" w:eastAsia="en-IL"/>
+        </w:rPr>
+        <w:t xml:space="preserve"> is the magnitude spectrogram smoothed across the frequency axis, </w:t>
+      </w:r>
+      <m:oMath>
+        <m:r>
+          <w:rPr>
+            <w:rFonts w:ascii="Cambria Math" w:hAnsi="Cambria Math" w:cs="Arial"/>
+            <w:lang w:val="en-IL" w:eastAsia="en-IL"/>
+          </w:rPr>
+          <m:t>power</m:t>
+        </m:r>
+      </m:oMath>
+      <w:r>
+        <w:rPr>
+          <w:rFonts w:ascii="Arial" w:hAnsi="Arial" w:cs="Arial"/>
+          <w:lang w:val="en-IL" w:eastAsia="en-IL"/>
+        </w:rPr>
+        <w:t xml:space="preserve"> is the exponent used to scale the magnitudes, </w:t>
+      </w:r>
+      <m:oMath>
+        <m:r>
+          <w:rPr>
+            <w:rFonts w:ascii="Cambria Math" w:hAnsi="Cambria Math" w:cs="Arial"/>
+            <w:lang w:val="en-IL" w:eastAsia="en-IL"/>
+          </w:rPr>
+          <m:t>margin</m:t>
+        </m:r>
+      </m:oMath>
+      <w:r>
+        <w:rPr>
+          <w:rFonts w:ascii="Arial" w:hAnsi="Arial" w:cs="Arial"/>
+          <w:lang w:val="en-IL" w:eastAsia="en-IL"/>
+        </w:rPr>
+        <w:t xml:space="preserve"> is the multiplier used to enforce strict separation between the tracks, and </w:t>
+      </w:r>
+      <m:oMath>
+        <m:r>
+          <w:rPr>
+            <w:rFonts w:ascii="Cambria Math" w:hAnsi="Cambria Math" w:cs="Arial"/>
+            <w:lang w:val="en-IL" w:eastAsia="en-IL"/>
+          </w:rPr>
+          <m:t>ϵ</m:t>
+        </m:r>
+      </m:oMath>
+      <w:r>
+        <w:rPr>
+          <w:rFonts w:ascii="Arial" w:hAnsi="Arial" w:cs="Arial"/>
+          <w:lang w:val="en-IL" w:eastAsia="en-IL"/>
+        </w:rPr>
+        <w:t xml:space="preserve"> is a very small constant added to the denominator to prevent division by zero.</w:t>
+      </w:r>
+    </w:p>
+    <w:p>
+      <w:pPr>
+        <w:numPr>
+          <w:ilvl w:val="0"/>
+          <w:numId w:val="14"/>
+        </w:numPr>
+        <w:tabs>
+          <w:tab w:val="clear" w:pos="720"/>
+          <w:tab w:val="num" w:pos="360"/>
+        </w:tabs>
+        <w:spacing w:line="240" w:lineRule="auto"/>
+        <w:ind w:left="360"/>
+        <w:rPr>
+          <w:rFonts w:ascii="Arial" w:hAnsi="Arial" w:cs="Arial"/>
+          <w:color w:val="1F1F1F"/>
+          <w:lang w:val="en-IL" w:eastAsia="en-IL"/>
+        </w:rPr>
+      </w:pPr>
+    </w:p>
+    <w:p>
+      <w:pPr>
+        <w:pStyle w:val="ListParagraph"/>
+        <w:rPr>
+          <w:rFonts w:ascii="Arial" w:hAnsi="Arial" w:cs="Arial"/>
+          <w:color w:val="1F1F1F"/>
+          <w:lang w:val="en-IL" w:eastAsia="en-IL"/>
+        </w:rPr>
+      </w:pPr>
+    </w:p>
+    <w:p>
+      <w:pPr>
         <w:spacing w:line="240" w:lineRule="auto"/>
         <w:ind w:left="720"/>
         <w:rPr>
@@ -6397,6 +7169,7 @@
           <w:bCs/>
           <w:lang w:val="en-IL"/>
         </w:rPr>
+        <w:lastRenderedPageBreak/>
         <w:t>Time-Scale Modification (TSM)</w:t>
       </w:r>
     </w:p>
@@ -6479,6 +7252,495 @@
         </w:rPr>
         <w:t xml:space="preserve"> </w:t>
       </w:r>
+    </w:p>
+    <w:p>
+      <w:pPr>
+        <w:spacing w:line="240" w:lineRule="auto"/>
+        <w:ind w:left="720"/>
+        <w:rPr>
+          <w:rFonts w:ascii="Arial" w:hAnsi="Arial" w:cs="Arial"/>
+          <w:color w:val="1F1F1F"/>
+          <w:lang w:val="en-IL" w:eastAsia="en-IL"/>
+        </w:rPr>
+      </w:pPr>
+    </w:p>
+    <w:p>
+      <w:pPr>
+        <w:pStyle w:val="ListParagraph"/>
+        <w:numPr>
+          <w:ilvl w:val="0"/>
+          <w:numId w:val="15"/>
+        </w:numPr>
+        <w:spacing w:after="100" w:afterAutospacing="1" w:line="240" w:lineRule="auto"/>
+        <w:rPr>
+          <w:rFonts w:ascii="Arial" w:hAnsi="Arial" w:cs="Arial"/>
+          <w:lang w:val="en-IL" w:eastAsia="en-IL"/>
+        </w:rPr>
+      </w:pPr>
+      <w:r>
+        <w:rPr>
+          <w:rFonts w:ascii="Arial" w:hAnsi="Arial" w:cs="Arial"/>
+          <w:b/>
+          <w:bCs/>
+          <w:lang w:val="en-IL" w:eastAsia="en-IL"/>
+        </w:rPr>
+        <w:t>Mathematical Definition:</w:t>
+      </w:r>
+      <w:r>
+        <w:rPr>
+          <w:rFonts w:ascii="Arial" w:hAnsi="Arial" w:cs="Arial"/>
+          <w:lang w:val="en-IL" w:eastAsia="en-IL"/>
+        </w:rPr>
+        <w:t xml:space="preserve"> The WSOLA analysis hop and optimal shift are calculated as follows:</w:t>
+      </w:r>
+    </w:p>
+    <w:p>
+      <w:pPr>
+        <w:pStyle w:val="ListParagraph"/>
+        <w:spacing w:line="240" w:lineRule="auto"/>
+        <w:rPr>
+          <w:rFonts w:ascii="Arial" w:hAnsi="Arial" w:cs="Arial"/>
+          <w:lang w:val="en-IL" w:eastAsia="en-IL"/>
+        </w:rPr>
+      </w:pPr>
+      <m:oMathPara>
+        <m:oMath>
+          <m:sSub>
+            <m:sSubPr>
+              <m:ctrlPr>
+                <w:rPr>
+                  <w:rFonts w:ascii="Cambria Math" w:hAnsi="Cambria Math" w:cs="Arial"/>
+                  <w:lang w:val="en-IL" w:eastAsia="en-IL"/>
+                </w:rPr>
+              </m:ctrlPr>
+            </m:sSubPr>
+            <m:e>
+              <m:r>
+                <w:rPr>
+                  <w:rFonts w:ascii="Cambria Math" w:hAnsi="Cambria Math" w:cs="Arial"/>
+                  <w:lang w:val="en-IL" w:eastAsia="en-IL"/>
+                </w:rPr>
+                <m:t>H</m:t>
+              </m:r>
+            </m:e>
+            <m:sub>
+              <m:r>
+                <w:rPr>
+                  <w:rFonts w:ascii="Cambria Math" w:hAnsi="Cambria Math" w:cs="Arial"/>
+                  <w:lang w:val="en-IL" w:eastAsia="en-IL"/>
+                </w:rPr>
+                <m:t>a</m:t>
+              </m:r>
+            </m:sub>
+          </m:sSub>
+          <m:r>
+            <w:rPr>
+              <w:rFonts w:ascii="Cambria Math" w:hAnsi="Cambria Math" w:cs="Arial"/>
+              <w:lang w:val="en-IL" w:eastAsia="en-IL"/>
+            </w:rPr>
+            <m:t>=</m:t>
+          </m:r>
+          <m:sSub>
+            <m:sSubPr>
+              <m:ctrlPr>
+                <w:rPr>
+                  <w:rFonts w:ascii="Cambria Math" w:hAnsi="Cambria Math" w:cs="Arial"/>
+                  <w:lang w:val="en-IL" w:eastAsia="en-IL"/>
+                </w:rPr>
+              </m:ctrlPr>
+            </m:sSubPr>
+            <m:e>
+              <m:r>
+                <w:rPr>
+                  <w:rFonts w:ascii="Cambria Math" w:hAnsi="Cambria Math" w:cs="Arial"/>
+                  <w:lang w:val="en-IL" w:eastAsia="en-IL"/>
+                </w:rPr>
+                <m:t>H</m:t>
+              </m:r>
+            </m:e>
+            <m:sub>
+              <m:r>
+                <w:rPr>
+                  <w:rFonts w:ascii="Cambria Math" w:hAnsi="Cambria Math" w:cs="Arial"/>
+                  <w:lang w:val="en-IL" w:eastAsia="en-IL"/>
+                </w:rPr>
+                <m:t>s</m:t>
+              </m:r>
+            </m:sub>
+          </m:sSub>
+          <m:r>
+            <w:rPr>
+              <w:rFonts w:ascii="Cambria Math" w:hAnsi="Cambria Math" w:cs="Arial"/>
+              <w:lang w:val="en-IL" w:eastAsia="en-IL"/>
+            </w:rPr>
+            <m:t>⋅rate</m:t>
+          </m:r>
+        </m:oMath>
+      </m:oMathPara>
+    </w:p>
+    <w:p>
+      <w:pPr>
+        <w:pStyle w:val="ListParagraph"/>
+        <w:spacing w:line="240" w:lineRule="auto"/>
+        <w:rPr>
+          <w:rFonts w:ascii="Arial" w:hAnsi="Arial" w:cs="Arial"/>
+          <w:lang w:val="en-IL" w:eastAsia="en-IL"/>
+        </w:rPr>
+      </w:pPr>
+      <m:oMathPara>
+        <m:oMath>
+          <m:sSub>
+            <m:sSubPr>
+              <m:ctrlPr>
+                <w:rPr>
+                  <w:rFonts w:ascii="Cambria Math" w:hAnsi="Cambria Math" w:cs="Arial"/>
+                  <w:lang w:val="en-IL" w:eastAsia="en-IL"/>
+                </w:rPr>
+              </m:ctrlPr>
+            </m:sSubPr>
+            <m:e>
+              <m:r>
+                <m:rPr>
+                  <m:sty m:val="p"/>
+                </m:rPr>
+                <w:rPr>
+                  <w:rFonts w:ascii="Cambria Math" w:hAnsi="Cambria Math" w:cs="Arial"/>
+                  <w:lang w:val="en-IL" w:eastAsia="en-IL"/>
+                </w:rPr>
+                <m:t>Δ</m:t>
+              </m:r>
+            </m:e>
+            <m:sub>
+              <m:r>
+                <w:rPr>
+                  <w:rFonts w:ascii="Cambria Math" w:hAnsi="Cambria Math" w:cs="Arial"/>
+                  <w:lang w:val="en-IL" w:eastAsia="en-IL"/>
+                </w:rPr>
+                <m:t>opt</m:t>
+              </m:r>
+            </m:sub>
+          </m:sSub>
+          <m:r>
+            <w:rPr>
+              <w:rFonts w:ascii="Cambria Math" w:hAnsi="Cambria Math" w:cs="Arial"/>
+              <w:lang w:val="en-IL" w:eastAsia="en-IL"/>
+            </w:rPr>
+            <m:t>=</m:t>
+          </m:r>
+          <m:func>
+            <m:funcPr>
+              <m:ctrlPr>
+                <w:rPr>
+                  <w:rFonts w:ascii="Cambria Math" w:hAnsi="Cambria Math" w:cs="Arial"/>
+                  <w:lang w:val="en-IL" w:eastAsia="en-IL"/>
+                </w:rPr>
+              </m:ctrlPr>
+            </m:funcPr>
+            <m:fName>
+              <m:r>
+                <m:rPr>
+                  <m:sty m:val="p"/>
+                </m:rPr>
+                <w:rPr>
+                  <w:rFonts w:ascii="Cambria Math" w:hAnsi="Cambria Math" w:cs="Arial"/>
+                  <w:lang w:val="en-IL" w:eastAsia="en-IL"/>
+                </w:rPr>
+                <m:t>arg</m:t>
+              </m:r>
+            </m:fName>
+            <m:e>
+              <m:func>
+                <m:funcPr>
+                  <m:ctrlPr>
+                    <w:rPr>
+                      <w:rFonts w:ascii="Cambria Math" w:hAnsi="Cambria Math" w:cs="Arial"/>
+                      <w:lang w:val="en-IL" w:eastAsia="en-IL"/>
+                    </w:rPr>
+                  </m:ctrlPr>
+                </m:funcPr>
+                <m:fName>
+                  <m:limLow>
+                    <m:limLowPr>
+                      <m:ctrlPr>
+                        <w:rPr>
+                          <w:rFonts w:ascii="Cambria Math" w:hAnsi="Cambria Math" w:cs="Arial"/>
+                          <w:lang w:val="en-IL" w:eastAsia="en-IL"/>
+                        </w:rPr>
+                      </m:ctrlPr>
+                    </m:limLowPr>
+                    <m:e>
+                      <m:r>
+                        <m:rPr>
+                          <m:sty m:val="p"/>
+                        </m:rPr>
+                        <w:rPr>
+                          <w:rFonts w:ascii="Cambria Math" w:hAnsi="Cambria Math" w:cs="Arial"/>
+                          <w:lang w:val="en-IL" w:eastAsia="en-IL"/>
+                        </w:rPr>
+                        <m:t>max</m:t>
+                      </m:r>
+                    </m:e>
+                    <m:lim>
+                      <m:r>
+                        <w:rPr>
+                          <w:rFonts w:ascii="Cambria Math" w:hAnsi="Cambria Math" w:cs="Arial"/>
+                          <w:lang w:val="en-IL" w:eastAsia="en-IL"/>
+                        </w:rPr>
+                        <m:t>δ</m:t>
+                      </m:r>
+                    </m:lim>
+                  </m:limLow>
+                </m:fName>
+                <m:e>
+                  <m:nary>
+                    <m:naryPr>
+                      <m:chr m:val="∑"/>
+                      <m:limLoc m:val="undOvr"/>
+                      <m:subHide m:val="1"/>
+                      <m:supHide m:val="1"/>
+                      <m:ctrlPr>
+                        <w:rPr>
+                          <w:rFonts w:ascii="Cambria Math" w:hAnsi="Cambria Math" w:cs="Arial"/>
+                          <w:lang w:val="en-IL" w:eastAsia="en-IL"/>
+                        </w:rPr>
+                      </m:ctrlPr>
+                    </m:naryPr>
+                    <m:sub/>
+                    <m:sup/>
+                    <m:e>
+                      <m:d>
+                        <m:dPr>
+                          <m:ctrlPr>
+                            <w:rPr>
+                              <w:rFonts w:ascii="Cambria Math" w:hAnsi="Cambria Math" w:cs="Arial"/>
+                              <w:lang w:val="en-IL" w:eastAsia="en-IL"/>
+                            </w:rPr>
+                          </m:ctrlPr>
+                        </m:dPr>
+                        <m:e>
+                          <m:r>
+                            <w:rPr>
+                              <w:rFonts w:ascii="Cambria Math" w:hAnsi="Cambria Math" w:cs="Arial"/>
+                              <w:lang w:val="en-IL" w:eastAsia="en-IL"/>
+                            </w:rPr>
+                            <m:t>SearchRegion⋅Template</m:t>
+                          </m:r>
+                        </m:e>
+                      </m:d>
+                    </m:e>
+                  </m:nary>
+                </m:e>
+              </m:func>
+            </m:e>
+          </m:func>
+        </m:oMath>
+      </m:oMathPara>
+    </w:p>
+    <w:p>
+      <w:pPr>
+        <w:pStyle w:val="ListParagraph"/>
+        <w:spacing w:after="100" w:afterAutospacing="1" w:line="240" w:lineRule="auto"/>
+        <w:rPr>
+          <w:rFonts w:ascii="Arial" w:hAnsi="Arial" w:cs="Arial"/>
+          <w:lang w:val="en-IL" w:eastAsia="en-IL"/>
+        </w:rPr>
+      </w:pPr>
+      <w:r>
+        <w:rPr>
+          <w:rFonts w:ascii="Arial" w:hAnsi="Arial" w:cs="Arial"/>
+          <w:lang w:val="en-IL" w:eastAsia="en-IL"/>
+        </w:rPr>
+        <w:t xml:space="preserve">where </w:t>
+      </w:r>
+      <m:oMath>
+        <m:sSub>
+          <m:sSubPr>
+            <m:ctrlPr>
+              <w:rPr>
+                <w:rFonts w:ascii="Cambria Math" w:hAnsi="Cambria Math" w:cs="Arial"/>
+                <w:lang w:val="en-IL" w:eastAsia="en-IL"/>
+              </w:rPr>
+            </m:ctrlPr>
+          </m:sSubPr>
+          <m:e>
+            <m:r>
+              <w:rPr>
+                <w:rFonts w:ascii="Cambria Math" w:hAnsi="Cambria Math" w:cs="Arial"/>
+                <w:lang w:val="en-IL" w:eastAsia="en-IL"/>
+              </w:rPr>
+              <m:t>H</m:t>
+            </m:r>
+          </m:e>
+          <m:sub>
+            <m:r>
+              <w:rPr>
+                <w:rFonts w:ascii="Cambria Math" w:hAnsi="Cambria Math" w:cs="Arial"/>
+                <w:lang w:val="en-IL" w:eastAsia="en-IL"/>
+              </w:rPr>
+              <m:t>s</m:t>
+            </m:r>
+          </m:sub>
+        </m:sSub>
+      </m:oMath>
+      <w:r>
+        <w:rPr>
+          <w:rFonts w:ascii="Arial" w:hAnsi="Arial" w:cs="Arial"/>
+          <w:lang w:val="en-IL" w:eastAsia="en-IL"/>
+        </w:rPr>
+        <w:t xml:space="preserve"> is the synthesis hop size (the spacing in the output audio), </w:t>
+      </w:r>
+      <m:oMath>
+        <m:r>
+          <w:rPr>
+            <w:rFonts w:ascii="Cambria Math" w:hAnsi="Cambria Math" w:cs="Arial"/>
+            <w:lang w:val="en-IL" w:eastAsia="en-IL"/>
+          </w:rPr>
+          <m:t>rate</m:t>
+        </m:r>
+      </m:oMath>
+      <w:r>
+        <w:rPr>
+          <w:rFonts w:ascii="Arial" w:hAnsi="Arial" w:cs="Arial"/>
+          <w:lang w:val="en-IL" w:eastAsia="en-IL"/>
+        </w:rPr>
+        <w:t xml:space="preserve"> is the desired time-stretch ratio, </w:t>
+      </w:r>
+      <m:oMath>
+        <m:sSub>
+          <m:sSubPr>
+            <m:ctrlPr>
+              <w:rPr>
+                <w:rFonts w:ascii="Cambria Math" w:hAnsi="Cambria Math" w:cs="Arial"/>
+                <w:lang w:val="en-IL" w:eastAsia="en-IL"/>
+              </w:rPr>
+            </m:ctrlPr>
+          </m:sSubPr>
+          <m:e>
+            <m:r>
+              <w:rPr>
+                <w:rFonts w:ascii="Cambria Math" w:hAnsi="Cambria Math" w:cs="Arial"/>
+                <w:lang w:val="en-IL" w:eastAsia="en-IL"/>
+              </w:rPr>
+              <m:t>H</m:t>
+            </m:r>
+          </m:e>
+          <m:sub>
+            <m:r>
+              <w:rPr>
+                <w:rFonts w:ascii="Cambria Math" w:hAnsi="Cambria Math" w:cs="Arial"/>
+                <w:lang w:val="en-IL" w:eastAsia="en-IL"/>
+              </w:rPr>
+              <m:t>a</m:t>
+            </m:r>
+          </m:sub>
+        </m:sSub>
+      </m:oMath>
+      <w:r>
+        <w:rPr>
+          <w:rFonts w:ascii="Arial" w:hAnsi="Arial" w:cs="Arial"/>
+          <w:lang w:val="en-IL" w:eastAsia="en-IL"/>
+        </w:rPr>
+        <w:t xml:space="preserve"> is the resulting analysis hop size (the spacing in the input audio), </w:t>
+      </w:r>
+      <m:oMath>
+        <m:r>
+          <w:rPr>
+            <w:rFonts w:ascii="Cambria Math" w:hAnsi="Cambria Math" w:cs="Arial"/>
+            <w:lang w:val="en-IL" w:eastAsia="en-IL"/>
+          </w:rPr>
+          <m:t>Template</m:t>
+        </m:r>
+      </m:oMath>
+      <w:r>
+        <w:rPr>
+          <w:rFonts w:ascii="Arial" w:hAnsi="Arial" w:cs="Arial"/>
+          <w:lang w:val="en-IL" w:eastAsia="en-IL"/>
+        </w:rPr>
+        <w:t xml:space="preserve"> is the overlapping section of the already-constructed output signal, </w:t>
+      </w:r>
+      <m:oMath>
+        <m:r>
+          <w:rPr>
+            <w:rFonts w:ascii="Cambria Math" w:hAnsi="Cambria Math" w:cs="Arial"/>
+            <w:lang w:val="en-IL" w:eastAsia="en-IL"/>
+          </w:rPr>
+          <m:t>SearchRegion</m:t>
+        </m:r>
+      </m:oMath>
+      <w:r>
+        <w:rPr>
+          <w:rFonts w:ascii="Arial" w:hAnsi="Arial" w:cs="Arial"/>
+          <w:lang w:val="en-IL" w:eastAsia="en-IL"/>
+        </w:rPr>
+        <w:t xml:space="preserve"> is the constrained window of input audio being scanned, </w:t>
+      </w:r>
+      <m:oMath>
+        <m:r>
+          <w:rPr>
+            <w:rFonts w:ascii="Cambria Math" w:hAnsi="Cambria Math" w:cs="Arial"/>
+            <w:lang w:val="en-IL" w:eastAsia="en-IL"/>
+          </w:rPr>
+          <m:t>δ</m:t>
+        </m:r>
+      </m:oMath>
+      <w:r>
+        <w:rPr>
+          <w:rFonts w:ascii="Arial" w:hAnsi="Arial" w:cs="Arial"/>
+          <w:lang w:val="en-IL" w:eastAsia="en-IL"/>
+        </w:rPr>
+        <w:t xml:space="preserve"> is the currently tested shift distance, and </w:t>
+      </w:r>
+      <m:oMath>
+        <m:sSub>
+          <m:sSubPr>
+            <m:ctrlPr>
+              <w:rPr>
+                <w:rFonts w:ascii="Cambria Math" w:hAnsi="Cambria Math" w:cs="Arial"/>
+                <w:lang w:val="en-IL" w:eastAsia="en-IL"/>
+              </w:rPr>
+            </m:ctrlPr>
+          </m:sSubPr>
+          <m:e>
+            <m:r>
+              <m:rPr>
+                <m:sty m:val="p"/>
+              </m:rPr>
+              <w:rPr>
+                <w:rFonts w:ascii="Cambria Math" w:hAnsi="Cambria Math" w:cs="Arial"/>
+                <w:lang w:val="en-IL" w:eastAsia="en-IL"/>
+              </w:rPr>
+              <m:t>Δ</m:t>
+            </m:r>
+          </m:e>
+          <m:sub>
+            <m:r>
+              <w:rPr>
+                <w:rFonts w:ascii="Cambria Math" w:hAnsi="Cambria Math" w:cs="Arial"/>
+                <w:lang w:val="en-IL" w:eastAsia="en-IL"/>
+              </w:rPr>
+              <m:t>opt</m:t>
+            </m:r>
+          </m:sub>
+        </m:sSub>
+      </m:oMath>
+      <w:r>
+        <w:rPr>
+          <w:rFonts w:ascii="Arial" w:hAnsi="Arial" w:cs="Arial"/>
+          <w:lang w:val="en-IL" w:eastAsia="en-IL"/>
+        </w:rPr>
+        <w:t xml:space="preserve"> is the optimal time shift that produces the maximum cross-correlation to perfectly align the overlapping waveforms.</w:t>
+      </w:r>
+    </w:p>
+    <w:p>
+      <w:pPr>
+        <w:spacing w:line="240" w:lineRule="auto"/>
+        <w:ind w:left="720"/>
+        <w:rPr>
+          <w:rFonts w:ascii="Arial" w:hAnsi="Arial" w:cs="Arial"/>
+          <w:color w:val="1F1F1F"/>
+          <w:lang w:val="en-IL" w:eastAsia="en-IL"/>
+        </w:rPr>
+      </w:pPr>
     </w:p>
     <w:p>
       <w:pPr>
@@ -6564,6 +7826,742 @@
     </w:p>
     <w:p>
       <w:pPr>
+        <w:pStyle w:val="ListParagraph"/>
+        <w:numPr>
+          <w:ilvl w:val="0"/>
+          <w:numId w:val="15"/>
+        </w:numPr>
+        <w:spacing w:after="100" w:afterAutospacing="1" w:line="240" w:lineRule="auto"/>
+        <w:rPr>
+          <w:rFonts w:ascii="Arial" w:hAnsi="Arial" w:cs="Arial"/>
+          <w:lang w:val="en-IL" w:eastAsia="en-IL"/>
+        </w:rPr>
+      </w:pPr>
+      <w:r>
+        <w:rPr>
+          <w:rFonts w:ascii="Arial" w:hAnsi="Arial" w:cs="Arial"/>
+          <w:b/>
+          <w:bCs/>
+          <w:lang w:val="en-IL" w:eastAsia="en-IL"/>
+        </w:rPr>
+        <w:t>Mathematical Definition:</w:t>
+      </w:r>
+      <w:r>
+        <w:rPr>
+          <w:rFonts w:ascii="Arial" w:hAnsi="Arial" w:cs="Arial"/>
+          <w:lang w:val="en-IL" w:eastAsia="en-IL"/>
+        </w:rPr>
+        <w:t xml:space="preserve"> The Phase Vocoder phase accumulation is calculated as follows:</w:t>
+      </w:r>
+    </w:p>
+    <w:p>
+      <w:pPr>
+        <w:pStyle w:val="ListParagraph"/>
+        <w:spacing w:line="240" w:lineRule="auto"/>
+        <w:rPr>
+          <w:rFonts w:ascii="Arial" w:hAnsi="Arial" w:cs="Arial"/>
+          <w:lang w:val="en-IL" w:eastAsia="en-IL"/>
+        </w:rPr>
+      </w:pPr>
+      <m:oMathPara>
+        <m:oMath>
+          <m:r>
+            <m:rPr>
+              <m:sty m:val="p"/>
+            </m:rPr>
+            <w:rPr>
+              <w:rFonts w:ascii="Cambria Math" w:hAnsi="Cambria Math" w:cs="Arial"/>
+              <w:lang w:val="en-IL" w:eastAsia="en-IL"/>
+            </w:rPr>
+            <m:t>Δ</m:t>
+          </m:r>
+          <m:sSub>
+            <m:sSubPr>
+              <m:ctrlPr>
+                <w:rPr>
+                  <w:rFonts w:ascii="Cambria Math" w:hAnsi="Cambria Math" w:cs="Arial"/>
+                  <w:lang w:val="en-IL" w:eastAsia="en-IL"/>
+                </w:rPr>
+              </m:ctrlPr>
+            </m:sSubPr>
+            <m:e>
+              <m:r>
+                <w:rPr>
+                  <w:rFonts w:ascii="Cambria Math" w:hAnsi="Cambria Math" w:cs="Arial"/>
+                  <w:lang w:val="en-IL" w:eastAsia="en-IL"/>
+                </w:rPr>
+                <m:t>ϕ</m:t>
+              </m:r>
+            </m:e>
+            <m:sub>
+              <m:r>
+                <w:rPr>
+                  <w:rFonts w:ascii="Cambria Math" w:hAnsi="Cambria Math" w:cs="Arial"/>
+                  <w:lang w:val="en-IL" w:eastAsia="en-IL"/>
+                </w:rPr>
+                <m:t>expected</m:t>
+              </m:r>
+            </m:sub>
+          </m:sSub>
+          <m:d>
+            <m:dPr>
+              <m:ctrlPr>
+                <w:rPr>
+                  <w:rFonts w:ascii="Cambria Math" w:hAnsi="Cambria Math" w:cs="Arial"/>
+                  <w:lang w:val="en-IL" w:eastAsia="en-IL"/>
+                </w:rPr>
+              </m:ctrlPr>
+            </m:dPr>
+            <m:e>
+              <m:r>
+                <w:rPr>
+                  <w:rFonts w:ascii="Cambria Math" w:hAnsi="Cambria Math" w:cs="Arial"/>
+                  <w:lang w:val="en-IL" w:eastAsia="en-IL"/>
+                </w:rPr>
+                <m:t>k</m:t>
+              </m:r>
+            </m:e>
+          </m:d>
+          <m:r>
+            <w:rPr>
+              <w:rFonts w:ascii="Cambria Math" w:hAnsi="Cambria Math" w:cs="Arial"/>
+              <w:lang w:val="en-IL" w:eastAsia="en-IL"/>
+            </w:rPr>
+            <m:t>=</m:t>
+          </m:r>
+          <m:f>
+            <m:fPr>
+              <m:ctrlPr>
+                <w:rPr>
+                  <w:rFonts w:ascii="Cambria Math" w:hAnsi="Cambria Math" w:cs="Arial"/>
+                  <w:lang w:val="en-IL" w:eastAsia="en-IL"/>
+                </w:rPr>
+              </m:ctrlPr>
+            </m:fPr>
+            <m:num>
+              <m:r>
+                <w:rPr>
+                  <w:rFonts w:ascii="Cambria Math" w:hAnsi="Cambria Math" w:cs="Arial"/>
+                  <w:lang w:val="en-IL" w:eastAsia="en-IL"/>
+                </w:rPr>
+                <m:t>2π⋅k⋅H</m:t>
+              </m:r>
+            </m:num>
+            <m:den>
+              <m:sSub>
+                <m:sSubPr>
+                  <m:ctrlPr>
+                    <w:rPr>
+                      <w:rFonts w:ascii="Cambria Math" w:hAnsi="Cambria Math" w:cs="Arial"/>
+                      <w:lang w:val="en-IL" w:eastAsia="en-IL"/>
+                    </w:rPr>
+                  </m:ctrlPr>
+                </m:sSubPr>
+                <m:e>
+                  <m:r>
+                    <w:rPr>
+                      <w:rFonts w:ascii="Cambria Math" w:hAnsi="Cambria Math" w:cs="Arial"/>
+                      <w:lang w:val="en-IL" w:eastAsia="en-IL"/>
+                    </w:rPr>
+                    <m:t>N</m:t>
+                  </m:r>
+                </m:e>
+                <m:sub>
+                  <m:r>
+                    <w:rPr>
+                      <w:rFonts w:ascii="Cambria Math" w:hAnsi="Cambria Math" w:cs="Arial"/>
+                      <w:lang w:val="en-IL" w:eastAsia="en-IL"/>
+                    </w:rPr>
+                    <m:t>fft</m:t>
+                  </m:r>
+                </m:sub>
+              </m:sSub>
+            </m:den>
+          </m:f>
+        </m:oMath>
+      </m:oMathPara>
+    </w:p>
+    <w:p>
+      <w:pPr>
+        <w:pStyle w:val="ListParagraph"/>
+        <w:spacing w:line="240" w:lineRule="auto"/>
+        <w:rPr>
+          <w:rFonts w:ascii="Arial" w:hAnsi="Arial" w:cs="Arial"/>
+          <w:lang w:val="en-IL" w:eastAsia="en-IL"/>
+        </w:rPr>
+      </w:pPr>
+      <m:oMathPara>
+        <m:oMath>
+          <m:sSub>
+            <m:sSubPr>
+              <m:ctrlPr>
+                <w:rPr>
+                  <w:rFonts w:ascii="Cambria Math" w:hAnsi="Cambria Math" w:cs="Arial"/>
+                  <w:lang w:val="en-IL" w:eastAsia="en-IL"/>
+                </w:rPr>
+              </m:ctrlPr>
+            </m:sSubPr>
+            <m:e>
+              <m:r>
+                <w:rPr>
+                  <w:rFonts w:ascii="Cambria Math" w:hAnsi="Cambria Math" w:cs="Arial"/>
+                  <w:lang w:val="en-IL" w:eastAsia="en-IL"/>
+                </w:rPr>
+                <m:t>ϕ</m:t>
+              </m:r>
+            </m:e>
+            <m:sub>
+              <m:r>
+                <w:rPr>
+                  <w:rFonts w:ascii="Cambria Math" w:hAnsi="Cambria Math" w:cs="Arial"/>
+                  <w:lang w:val="en-IL" w:eastAsia="en-IL"/>
+                </w:rPr>
+                <m:t>out</m:t>
+              </m:r>
+            </m:sub>
+          </m:sSub>
+          <m:d>
+            <m:dPr>
+              <m:ctrlPr>
+                <w:rPr>
+                  <w:rFonts w:ascii="Cambria Math" w:hAnsi="Cambria Math" w:cs="Arial"/>
+                  <w:lang w:val="en-IL" w:eastAsia="en-IL"/>
+                </w:rPr>
+              </m:ctrlPr>
+            </m:dPr>
+            <m:e>
+              <m:r>
+                <w:rPr>
+                  <w:rFonts w:ascii="Cambria Math" w:hAnsi="Cambria Math" w:cs="Arial"/>
+                  <w:lang w:val="en-IL" w:eastAsia="en-IL"/>
+                </w:rPr>
+                <m:t>t,k</m:t>
+              </m:r>
+            </m:e>
+          </m:d>
+          <m:r>
+            <w:rPr>
+              <w:rFonts w:ascii="Cambria Math" w:hAnsi="Cambria Math" w:cs="Arial"/>
+              <w:lang w:val="en-IL" w:eastAsia="en-IL"/>
+            </w:rPr>
+            <m:t>=</m:t>
+          </m:r>
+          <m:sSub>
+            <m:sSubPr>
+              <m:ctrlPr>
+                <w:rPr>
+                  <w:rFonts w:ascii="Cambria Math" w:hAnsi="Cambria Math" w:cs="Arial"/>
+                  <w:lang w:val="en-IL" w:eastAsia="en-IL"/>
+                </w:rPr>
+              </m:ctrlPr>
+            </m:sSubPr>
+            <m:e>
+              <m:r>
+                <w:rPr>
+                  <w:rFonts w:ascii="Cambria Math" w:hAnsi="Cambria Math" w:cs="Arial"/>
+                  <w:lang w:val="en-IL" w:eastAsia="en-IL"/>
+                </w:rPr>
+                <m:t>ϕ</m:t>
+              </m:r>
+            </m:e>
+            <m:sub>
+              <m:r>
+                <w:rPr>
+                  <w:rFonts w:ascii="Cambria Math" w:hAnsi="Cambria Math" w:cs="Arial"/>
+                  <w:lang w:val="en-IL" w:eastAsia="en-IL"/>
+                </w:rPr>
+                <m:t>out</m:t>
+              </m:r>
+            </m:sub>
+          </m:sSub>
+          <m:d>
+            <m:dPr>
+              <m:ctrlPr>
+                <w:rPr>
+                  <w:rFonts w:ascii="Cambria Math" w:hAnsi="Cambria Math" w:cs="Arial"/>
+                  <w:lang w:val="en-IL" w:eastAsia="en-IL"/>
+                </w:rPr>
+              </m:ctrlPr>
+            </m:dPr>
+            <m:e>
+              <m:r>
+                <w:rPr>
+                  <w:rFonts w:ascii="Cambria Math" w:hAnsi="Cambria Math" w:cs="Arial"/>
+                  <w:lang w:val="en-IL" w:eastAsia="en-IL"/>
+                </w:rPr>
+                <m:t>t-1,k</m:t>
+              </m:r>
+            </m:e>
+          </m:d>
+          <m:r>
+            <w:rPr>
+              <w:rFonts w:ascii="Cambria Math" w:hAnsi="Cambria Math" w:cs="Arial"/>
+              <w:lang w:val="en-IL" w:eastAsia="en-IL"/>
+            </w:rPr>
+            <m:t>+</m:t>
+          </m:r>
+          <m:r>
+            <m:rPr>
+              <m:sty m:val="p"/>
+            </m:rPr>
+            <w:rPr>
+              <w:rFonts w:ascii="Cambria Math" w:hAnsi="Cambria Math" w:cs="Arial"/>
+              <w:lang w:val="en-IL" w:eastAsia="en-IL"/>
+            </w:rPr>
+            <m:t>Δ</m:t>
+          </m:r>
+          <m:sSub>
+            <m:sSubPr>
+              <m:ctrlPr>
+                <w:rPr>
+                  <w:rFonts w:ascii="Cambria Math" w:hAnsi="Cambria Math" w:cs="Arial"/>
+                  <w:lang w:val="en-IL" w:eastAsia="en-IL"/>
+                </w:rPr>
+              </m:ctrlPr>
+            </m:sSubPr>
+            <m:e>
+              <m:r>
+                <w:rPr>
+                  <w:rFonts w:ascii="Cambria Math" w:hAnsi="Cambria Math" w:cs="Arial"/>
+                  <w:lang w:val="en-IL" w:eastAsia="en-IL"/>
+                </w:rPr>
+                <m:t>ϕ</m:t>
+              </m:r>
+            </m:e>
+            <m:sub>
+              <m:r>
+                <w:rPr>
+                  <w:rFonts w:ascii="Cambria Math" w:hAnsi="Cambria Math" w:cs="Arial"/>
+                  <w:lang w:val="en-IL" w:eastAsia="en-IL"/>
+                </w:rPr>
+                <m:t>expected</m:t>
+              </m:r>
+            </m:sub>
+          </m:sSub>
+          <m:d>
+            <m:dPr>
+              <m:ctrlPr>
+                <w:rPr>
+                  <w:rFonts w:ascii="Cambria Math" w:hAnsi="Cambria Math" w:cs="Arial"/>
+                  <w:lang w:val="en-IL" w:eastAsia="en-IL"/>
+                </w:rPr>
+              </m:ctrlPr>
+            </m:dPr>
+            <m:e>
+              <m:r>
+                <w:rPr>
+                  <w:rFonts w:ascii="Cambria Math" w:hAnsi="Cambria Math" w:cs="Arial"/>
+                  <w:lang w:val="en-IL" w:eastAsia="en-IL"/>
+                </w:rPr>
+                <m:t>k</m:t>
+              </m:r>
+            </m:e>
+          </m:d>
+          <m:r>
+            <w:rPr>
+              <w:rFonts w:ascii="Cambria Math" w:hAnsi="Cambria Math" w:cs="Arial"/>
+              <w:lang w:val="en-IL" w:eastAsia="en-IL"/>
+            </w:rPr>
+            <m:t>+</m:t>
+          </m:r>
+          <m:r>
+            <m:rPr>
+              <m:sty m:val="p"/>
+            </m:rPr>
+            <w:rPr>
+              <w:rFonts w:ascii="Cambria Math" w:hAnsi="Cambria Math" w:cs="Arial"/>
+              <w:lang w:val="en-IL" w:eastAsia="en-IL"/>
+            </w:rPr>
+            <m:t>Δ</m:t>
+          </m:r>
+          <m:sSub>
+            <m:sSubPr>
+              <m:ctrlPr>
+                <w:rPr>
+                  <w:rFonts w:ascii="Cambria Math" w:hAnsi="Cambria Math" w:cs="Arial"/>
+                  <w:lang w:val="en-IL" w:eastAsia="en-IL"/>
+                </w:rPr>
+              </m:ctrlPr>
+            </m:sSubPr>
+            <m:e>
+              <m:r>
+                <w:rPr>
+                  <w:rFonts w:ascii="Cambria Math" w:hAnsi="Cambria Math" w:cs="Arial"/>
+                  <w:lang w:val="en-IL" w:eastAsia="en-IL"/>
+                </w:rPr>
+                <m:t>ϕ</m:t>
+              </m:r>
+            </m:e>
+            <m:sub>
+              <m:r>
+                <w:rPr>
+                  <w:rFonts w:ascii="Cambria Math" w:hAnsi="Cambria Math" w:cs="Arial"/>
+                  <w:lang w:val="en-IL" w:eastAsia="en-IL"/>
+                </w:rPr>
+                <m:t>wrapped</m:t>
+              </m:r>
+            </m:sub>
+          </m:sSub>
+          <m:d>
+            <m:dPr>
+              <m:ctrlPr>
+                <w:rPr>
+                  <w:rFonts w:ascii="Cambria Math" w:hAnsi="Cambria Math" w:cs="Arial"/>
+                  <w:lang w:val="en-IL" w:eastAsia="en-IL"/>
+                </w:rPr>
+              </m:ctrlPr>
+            </m:dPr>
+            <m:e>
+              <m:r>
+                <w:rPr>
+                  <w:rFonts w:ascii="Cambria Math" w:hAnsi="Cambria Math" w:cs="Arial"/>
+                  <w:lang w:val="en-IL" w:eastAsia="en-IL"/>
+                </w:rPr>
+                <m:t>k</m:t>
+              </m:r>
+            </m:e>
+          </m:d>
+        </m:oMath>
+      </m:oMathPara>
+    </w:p>
+    <w:p>
+      <w:pPr>
+        <w:pStyle w:val="ListParagraph"/>
+        <w:spacing w:after="100" w:afterAutospacing="1" w:line="240" w:lineRule="auto"/>
+        <w:rPr>
+          <w:rFonts w:ascii="Arial" w:hAnsi="Arial" w:cs="Arial"/>
+          <w:lang w:val="en-IL" w:eastAsia="en-IL"/>
+        </w:rPr>
+      </w:pPr>
+      <w:r>
+        <w:rPr>
+          <w:rFonts w:ascii="Arial" w:hAnsi="Arial" w:cs="Arial"/>
+          <w:lang w:val="en-IL" w:eastAsia="en-IL"/>
+        </w:rPr>
+        <w:lastRenderedPageBreak/>
+        <w:t xml:space="preserve">where </w:t>
+      </w:r>
+      <m:oMath>
+        <m:r>
+          <w:rPr>
+            <w:rFonts w:ascii="Cambria Math" w:hAnsi="Cambria Math" w:cs="Arial"/>
+            <w:lang w:val="en-IL" w:eastAsia="en-IL"/>
+          </w:rPr>
+          <m:t>k</m:t>
+        </m:r>
+      </m:oMath>
+      <w:r>
+        <w:rPr>
+          <w:rFonts w:ascii="Arial" w:hAnsi="Arial" w:cs="Arial"/>
+          <w:lang w:val="en-IL" w:eastAsia="en-IL"/>
+        </w:rPr>
+        <w:t xml:space="preserve"> is the frequency bin index, </w:t>
+      </w:r>
+      <m:oMath>
+        <m:r>
+          <w:rPr>
+            <w:rFonts w:ascii="Cambria Math" w:hAnsi="Cambria Math" w:cs="Arial"/>
+            <w:lang w:val="en-IL" w:eastAsia="en-IL"/>
+          </w:rPr>
+          <m:t>H</m:t>
+        </m:r>
+      </m:oMath>
+      <w:r>
+        <w:rPr>
+          <w:rFonts w:ascii="Arial" w:hAnsi="Arial" w:cs="Arial"/>
+          <w:lang w:val="en-IL" w:eastAsia="en-IL"/>
+        </w:rPr>
+        <w:t xml:space="preserve"> is the hop size, </w:t>
+      </w:r>
+      <m:oMath>
+        <m:sSub>
+          <m:sSubPr>
+            <m:ctrlPr>
+              <w:rPr>
+                <w:rFonts w:ascii="Cambria Math" w:hAnsi="Cambria Math" w:cs="Arial"/>
+                <w:lang w:val="en-IL" w:eastAsia="en-IL"/>
+              </w:rPr>
+            </m:ctrlPr>
+          </m:sSubPr>
+          <m:e>
+            <m:r>
+              <w:rPr>
+                <w:rFonts w:ascii="Cambria Math" w:hAnsi="Cambria Math" w:cs="Arial"/>
+                <w:lang w:val="en-IL" w:eastAsia="en-IL"/>
+              </w:rPr>
+              <m:t>N</m:t>
+            </m:r>
+          </m:e>
+          <m:sub>
+            <m:r>
+              <w:rPr>
+                <w:rFonts w:ascii="Cambria Math" w:hAnsi="Cambria Math" w:cs="Arial"/>
+                <w:lang w:val="en-IL" w:eastAsia="en-IL"/>
+              </w:rPr>
+              <m:t>fft</m:t>
+            </m:r>
+          </m:sub>
+        </m:sSub>
+      </m:oMath>
+      <w:r>
+        <w:rPr>
+          <w:rFonts w:ascii="Arial" w:hAnsi="Arial" w:cs="Arial"/>
+          <w:lang w:val="en-IL" w:eastAsia="en-IL"/>
+        </w:rPr>
+        <w:t xml:space="preserve"> is the FFT window size, </w:t>
+      </w:r>
+      <m:oMath>
+        <m:r>
+          <m:rPr>
+            <m:sty m:val="p"/>
+          </m:rPr>
+          <w:rPr>
+            <w:rFonts w:ascii="Cambria Math" w:hAnsi="Cambria Math" w:cs="Arial"/>
+            <w:lang w:val="en-IL" w:eastAsia="en-IL"/>
+          </w:rPr>
+          <m:t>Δ</m:t>
+        </m:r>
+        <m:sSub>
+          <m:sSubPr>
+            <m:ctrlPr>
+              <w:rPr>
+                <w:rFonts w:ascii="Cambria Math" w:hAnsi="Cambria Math" w:cs="Arial"/>
+                <w:lang w:val="en-IL" w:eastAsia="en-IL"/>
+              </w:rPr>
+            </m:ctrlPr>
+          </m:sSubPr>
+          <m:e>
+            <m:r>
+              <w:rPr>
+                <w:rFonts w:ascii="Cambria Math" w:hAnsi="Cambria Math" w:cs="Arial"/>
+                <w:lang w:val="en-IL" w:eastAsia="en-IL"/>
+              </w:rPr>
+              <m:t>ϕ</m:t>
+            </m:r>
+          </m:e>
+          <m:sub>
+            <m:r>
+              <w:rPr>
+                <w:rFonts w:ascii="Cambria Math" w:hAnsi="Cambria Math" w:cs="Arial"/>
+                <w:lang w:val="en-IL" w:eastAsia="en-IL"/>
+              </w:rPr>
+              <m:t>expected</m:t>
+            </m:r>
+          </m:sub>
+        </m:sSub>
+        <m:d>
+          <m:dPr>
+            <m:ctrlPr>
+              <w:rPr>
+                <w:rFonts w:ascii="Cambria Math" w:hAnsi="Cambria Math" w:cs="Arial"/>
+                <w:lang w:val="en-IL" w:eastAsia="en-IL"/>
+              </w:rPr>
+            </m:ctrlPr>
+          </m:dPr>
+          <m:e>
+            <m:r>
+              <w:rPr>
+                <w:rFonts w:ascii="Cambria Math" w:hAnsi="Cambria Math" w:cs="Arial"/>
+                <w:lang w:val="en-IL" w:eastAsia="en-IL"/>
+              </w:rPr>
+              <m:t>k</m:t>
+            </m:r>
+          </m:e>
+        </m:d>
+      </m:oMath>
+      <w:r>
+        <w:rPr>
+          <w:rFonts w:ascii="Arial" w:hAnsi="Arial" w:cs="Arial"/>
+          <w:lang w:val="en-IL" w:eastAsia="en-IL"/>
+        </w:rPr>
+        <w:t xml:space="preserve"> is the theoretically predicted phase advance for a steady frequency, </w:t>
+      </w:r>
+      <m:oMath>
+        <m:r>
+          <m:rPr>
+            <m:sty m:val="p"/>
+          </m:rPr>
+          <w:rPr>
+            <w:rFonts w:ascii="Cambria Math" w:hAnsi="Cambria Math" w:cs="Arial"/>
+            <w:lang w:val="en-IL" w:eastAsia="en-IL"/>
+          </w:rPr>
+          <m:t>Δ</m:t>
+        </m:r>
+        <m:sSub>
+          <m:sSubPr>
+            <m:ctrlPr>
+              <w:rPr>
+                <w:rFonts w:ascii="Cambria Math" w:hAnsi="Cambria Math" w:cs="Arial"/>
+                <w:lang w:val="en-IL" w:eastAsia="en-IL"/>
+              </w:rPr>
+            </m:ctrlPr>
+          </m:sSubPr>
+          <m:e>
+            <m:r>
+              <w:rPr>
+                <w:rFonts w:ascii="Cambria Math" w:hAnsi="Cambria Math" w:cs="Arial"/>
+                <w:lang w:val="en-IL" w:eastAsia="en-IL"/>
+              </w:rPr>
+              <m:t>ϕ</m:t>
+            </m:r>
+          </m:e>
+          <m:sub>
+            <m:r>
+              <w:rPr>
+                <w:rFonts w:ascii="Cambria Math" w:hAnsi="Cambria Math" w:cs="Arial"/>
+                <w:lang w:val="en-IL" w:eastAsia="en-IL"/>
+              </w:rPr>
+              <m:t>wrapped</m:t>
+            </m:r>
+          </m:sub>
+        </m:sSub>
+        <m:d>
+          <m:dPr>
+            <m:ctrlPr>
+              <w:rPr>
+                <w:rFonts w:ascii="Cambria Math" w:hAnsi="Cambria Math" w:cs="Arial"/>
+                <w:lang w:val="en-IL" w:eastAsia="en-IL"/>
+              </w:rPr>
+            </m:ctrlPr>
+          </m:dPr>
+          <m:e>
+            <m:r>
+              <w:rPr>
+                <w:rFonts w:ascii="Cambria Math" w:hAnsi="Cambria Math" w:cs="Arial"/>
+                <w:lang w:val="en-IL" w:eastAsia="en-IL"/>
+              </w:rPr>
+              <m:t>k</m:t>
+            </m:r>
+          </m:e>
+        </m:d>
+      </m:oMath>
+      <w:r>
+        <w:rPr>
+          <w:rFonts w:ascii="Arial" w:hAnsi="Arial" w:cs="Arial"/>
+          <w:lang w:val="en-IL" w:eastAsia="en-IL"/>
+        </w:rPr>
+        <w:t xml:space="preserve"> is the actual measured phase difference wrapped to the </w:t>
+      </w:r>
+      <m:oMath>
+        <m:d>
+          <m:dPr>
+            <m:begChr m:val="["/>
+            <m:endChr m:val="]"/>
+            <m:ctrlPr>
+              <w:rPr>
+                <w:rFonts w:ascii="Cambria Math" w:hAnsi="Cambria Math" w:cs="Arial"/>
+                <w:lang w:val="en-IL" w:eastAsia="en-IL"/>
+              </w:rPr>
+            </m:ctrlPr>
+          </m:dPr>
+          <m:e>
+            <m:r>
+              <w:rPr>
+                <w:rFonts w:ascii="Cambria Math" w:hAnsi="Cambria Math" w:cs="Arial"/>
+                <w:lang w:val="en-IL" w:eastAsia="en-IL"/>
+              </w:rPr>
+              <m:t>-π,π</m:t>
+            </m:r>
+          </m:e>
+        </m:d>
+      </m:oMath>
+      <w:r>
+        <w:rPr>
+          <w:rFonts w:ascii="Arial" w:hAnsi="Arial" w:cs="Arial"/>
+          <w:lang w:val="en-IL" w:eastAsia="en-IL"/>
+        </w:rPr>
+        <w:t xml:space="preserve"> boundary, and </w:t>
+      </w:r>
+      <m:oMath>
+        <m:sSub>
+          <m:sSubPr>
+            <m:ctrlPr>
+              <w:rPr>
+                <w:rFonts w:ascii="Cambria Math" w:hAnsi="Cambria Math" w:cs="Arial"/>
+                <w:lang w:val="en-IL" w:eastAsia="en-IL"/>
+              </w:rPr>
+            </m:ctrlPr>
+          </m:sSubPr>
+          <m:e>
+            <m:r>
+              <w:rPr>
+                <w:rFonts w:ascii="Cambria Math" w:hAnsi="Cambria Math" w:cs="Arial"/>
+                <w:lang w:val="en-IL" w:eastAsia="en-IL"/>
+              </w:rPr>
+              <m:t>ϕ</m:t>
+            </m:r>
+          </m:e>
+          <m:sub>
+            <m:r>
+              <w:rPr>
+                <w:rFonts w:ascii="Cambria Math" w:hAnsi="Cambria Math" w:cs="Arial"/>
+                <w:lang w:val="en-IL" w:eastAsia="en-IL"/>
+              </w:rPr>
+              <m:t>out</m:t>
+            </m:r>
+          </m:sub>
+        </m:sSub>
+        <m:d>
+          <m:dPr>
+            <m:ctrlPr>
+              <w:rPr>
+                <w:rFonts w:ascii="Cambria Math" w:hAnsi="Cambria Math" w:cs="Arial"/>
+                <w:lang w:val="en-IL" w:eastAsia="en-IL"/>
+              </w:rPr>
+            </m:ctrlPr>
+          </m:dPr>
+          <m:e>
+            <m:r>
+              <w:rPr>
+                <w:rFonts w:ascii="Cambria Math" w:hAnsi="Cambria Math" w:cs="Arial"/>
+                <w:lang w:val="en-IL" w:eastAsia="en-IL"/>
+              </w:rPr>
+              <m:t>t,k</m:t>
+            </m:r>
+          </m:e>
+        </m:d>
+      </m:oMath>
+      <w:r>
+        <w:rPr>
+          <w:rFonts w:ascii="Arial" w:hAnsi="Arial" w:cs="Arial"/>
+          <w:lang w:val="en-IL" w:eastAsia="en-IL"/>
+        </w:rPr>
+        <w:t xml:space="preserve"> is the final accumulated phase applied to the new complex spectrogram to maintain the original pitch.</w:t>
+      </w:r>
+    </w:p>
+    <w:p>
+      <w:pPr>
+        <w:spacing w:line="240" w:lineRule="auto"/>
+        <w:ind w:left="720"/>
+        <w:rPr>
+          <w:rFonts w:ascii="Arial" w:hAnsi="Arial" w:cs="Arial"/>
+          <w:color w:val="1F1F1F"/>
+          <w:lang w:val="en-IL" w:eastAsia="en-IL"/>
+        </w:rPr>
+      </w:pPr>
+    </w:p>
+    <w:p>
+      <w:pPr>
+        <w:pStyle w:val="ListParagraph"/>
+        <w:rPr>
+          <w:rFonts w:ascii="Arial" w:hAnsi="Arial" w:cs="Arial"/>
+          <w:color w:val="1F1F1F"/>
+          <w:lang w:val="en-IL" w:eastAsia="en-IL"/>
+        </w:rPr>
+      </w:pPr>
+    </w:p>
+    <w:p>
+      <w:pPr>
+        <w:pStyle w:val="ListParagraph"/>
+        <w:rPr>
+          <w:rFonts w:ascii="Arial" w:hAnsi="Arial" w:cs="Arial"/>
+          <w:color w:val="1F1F1F"/>
+          <w:lang w:val="en-IL" w:eastAsia="en-IL"/>
+        </w:rPr>
+      </w:pPr>
+    </w:p>
+    <w:p>
+      <w:pPr>
         <w:spacing w:line="240" w:lineRule="auto"/>
         <w:rPr>
           <w:rFonts w:ascii="Arial" w:hAnsi="Arial" w:cs="Arial"/>
@@ -6633,6 +8631,7 @@
         <w:pStyle w:val="Heading1"/>
       </w:pPr>
       <w:r>
+        <w:lastRenderedPageBreak/>
         <w:t>Simulation</w:t>
       </w:r>
       <w:bookmarkEnd w:id="7"/>
@@ -6682,7 +8681,25 @@
           <w:color w:val="1F1F1F"/>
           <w:bdr w:val="none" w:sz="0" w:space="0" w:color="auto" w:frame="1"/>
         </w:rPr>
-        <w:t>The simulation environment for the "SyncRun" project was developed entirely in Python. Because the project focuses on an offline, pre-processing approach, the simulation does not require real-time hardware tracking but instead relies on computational digital signal processing (DSP) libraries. To conduct controlled experimentation and validate the algorithms, the system utilizes synthetic runner signals to simulate various step sequences and workout paces.</w:t>
+        <w:t>The simulation environment for the "</w:t>
+      </w:r>
+      <w:proofErr w:type="spellStart"/>
+      <w:r>
+        <w:rPr>
+          <w:rFonts w:ascii="Arial" w:hAnsi="Arial" w:cs="Arial"/>
+          <w:color w:val="1F1F1F"/>
+          <w:bdr w:val="none" w:sz="0" w:space="0" w:color="auto" w:frame="1"/>
+        </w:rPr>
+        <w:t>SyncRun</w:t>
+      </w:r>
+      <w:proofErr w:type="spellEnd"/>
+      <w:r>
+        <w:rPr>
+          <w:rFonts w:ascii="Arial" w:hAnsi="Arial" w:cs="Arial"/>
+          <w:color w:val="1F1F1F"/>
+          <w:bdr w:val="none" w:sz="0" w:space="0" w:color="auto" w:frame="1"/>
+        </w:rPr>
+        <w:t>" project was developed entirely in Python. Because the project focuses on an offline, pre-processing approach, the simulation does not require real-time hardware tracking but instead relies on computational digital signal processing (DSP) libraries. To conduct controlled experimentation and validate the algorithms, the system utilizes synthetic runner signals to simulate various step sequences and workout paces.</w:t>
       </w:r>
       <w:r>
         <w:rPr>
@@ -6709,6 +8726,7 @@
         </w:rPr>
         <w:t xml:space="preserve">The primary audio inputs consisted of real, simple rhythmic songs (e.g., "Seven Nation Army"), which were processed alongside the synthetic step vectors. Sequence extraction, including the detection of song onsets and global tempo (BPM), was implemented using the </w:t>
       </w:r>
+      <w:proofErr w:type="spellStart"/>
       <w:r>
         <w:rPr>
           <w:rStyle w:val="HTMLCode"/>
@@ -6720,6 +8738,7 @@
         </w:rPr>
         <w:t>librosa</w:t>
       </w:r>
+      <w:proofErr w:type="spellEnd"/>
       <w:r>
         <w:rPr>
           <w:rFonts w:ascii="Arial" w:hAnsi="Arial" w:cs="Arial"/>
@@ -6998,16 +9017,7 @@
           <w:color w:val="1F1F1F"/>
           <w:bdr w:val="none" w:sz="0" w:space="0" w:color="auto" w:frame="1"/>
         </w:rPr>
-        <w:t xml:space="preserve"> The system separated the audio using Harmonic-Percussive Separation (HPS) and applied the custom WSOLA and </w:t>
-      </w:r>
-      <w:r>
-        <w:rPr>
-          <w:rFonts w:ascii="Arial" w:hAnsi="Arial" w:cs="Arial"/>
-          <w:color w:val="1F1F1F"/>
-          <w:bdr w:val="none" w:sz="0" w:space="0" w:color="auto" w:frame="1"/>
-        </w:rPr>
-        <w:lastRenderedPageBreak/>
-        <w:t>Phase Vocoder algorithms respectively, before merging the tracks back together into a final output file.</w:t>
+        <w:t xml:space="preserve"> The system separated the audio using Harmonic-Percussive Separation (HPS) and applied the custom WSOLA and Phase Vocoder algorithms respectively, before merging the tracks back together into a final output file.</w:t>
       </w:r>
       <w:r>
         <w:rPr>
@@ -7340,8 +9350,20 @@
                 <w:color w:val="1F1F1F"/>
                 <w:bdr w:val="none" w:sz="0" w:space="0" w:color="auto" w:frame="1"/>
               </w:rPr>
-              <w:t>15.67 ms</w:t>
-            </w:r>
+              <w:t xml:space="preserve">15.67 </w:t>
+            </w:r>
+            <w:proofErr w:type="spellStart"/>
+            <w:r>
+              <w:rPr>
+                <w:rFonts w:ascii="Arial" w:hAnsi="Arial" w:cs="Arial"/>
+                <w:b/>
+                <w:bCs/>
+                <w:color w:val="1F1F1F"/>
+                <w:bdr w:val="none" w:sz="0" w:space="0" w:color="auto" w:frame="1"/>
+              </w:rPr>
+              <w:t>ms</w:t>
+            </w:r>
+            <w:proofErr w:type="spellEnd"/>
           </w:p>
         </w:tc>
         <w:tc>
@@ -7456,8 +9478,20 @@
                 <w:color w:val="1F1F1F"/>
                 <w:bdr w:val="none" w:sz="0" w:space="0" w:color="auto" w:frame="1"/>
               </w:rPr>
-              <w:t>475 ms</w:t>
-            </w:r>
+              <w:t xml:space="preserve">475 </w:t>
+            </w:r>
+            <w:proofErr w:type="spellStart"/>
+            <w:r>
+              <w:rPr>
+                <w:rFonts w:ascii="Arial" w:hAnsi="Arial" w:cs="Arial"/>
+                <w:b/>
+                <w:bCs/>
+                <w:color w:val="1F1F1F"/>
+                <w:bdr w:val="none" w:sz="0" w:space="0" w:color="auto" w:frame="1"/>
+              </w:rPr>
+              <w:t>ms</w:t>
+            </w:r>
+            <w:proofErr w:type="spellEnd"/>
           </w:p>
         </w:tc>
         <w:tc>
@@ -7654,7 +9688,63 @@
         <w:rPr>
           <w:lang w:val="en-IL"/>
         </w:rPr>
-        <w:t xml:space="preserve">The entire computational pipeline for the "SyncRun" project is implemented in Python, utilizing an array of specialized digital signal processing (DSP) and numerical computing libraries. The system relies heavily on NumPy for vectorized array operations, SciPy for signal transforms and filtering, Librosa for musical feature extraction, and Soundfile for high-fidelity audio output. To maintain optimal performance during development and testing, the system caches pre-processed audio arrays and metadata into .npy files, avoiding redundant processing times. </w:t>
+        <w:t>The entire computational pipeline for the "</w:t>
+      </w:r>
+      <w:proofErr w:type="spellStart"/>
+      <w:r>
+        <w:rPr>
+          <w:lang w:val="en-IL"/>
+        </w:rPr>
+        <w:t>SyncRun</w:t>
+      </w:r>
+      <w:proofErr w:type="spellEnd"/>
+      <w:r>
+        <w:rPr>
+          <w:lang w:val="en-IL"/>
+        </w:rPr>
+        <w:t xml:space="preserve">" project is implemented in Python, utilizing an array of specialized digital signal processing (DSP) and numerical computing libraries. The system relies heavily on NumPy for vectorized array operations, SciPy for signal transforms and filtering, </w:t>
+      </w:r>
+      <w:proofErr w:type="spellStart"/>
+      <w:r>
+        <w:rPr>
+          <w:lang w:val="en-IL"/>
+        </w:rPr>
+        <w:t>Librosa</w:t>
+      </w:r>
+      <w:proofErr w:type="spellEnd"/>
+      <w:r>
+        <w:rPr>
+          <w:lang w:val="en-IL"/>
+        </w:rPr>
+        <w:t xml:space="preserve"> for musical feature extraction, and </w:t>
+      </w:r>
+      <w:proofErr w:type="spellStart"/>
+      <w:r>
+        <w:rPr>
+          <w:lang w:val="en-IL"/>
+        </w:rPr>
+        <w:t>Soundfile</w:t>
+      </w:r>
+      <w:proofErr w:type="spellEnd"/>
+      <w:r>
+        <w:rPr>
+          <w:lang w:val="en-IL"/>
+        </w:rPr>
+        <w:t xml:space="preserve"> for high-fidelity audio output. To maintain optimal performance during development and testing, the system caches pre-processed audio arrays and metadata into .</w:t>
+      </w:r>
+      <w:proofErr w:type="spellStart"/>
+      <w:r>
+        <w:rPr>
+          <w:lang w:val="en-IL"/>
+        </w:rPr>
+        <w:t>npy</w:t>
+      </w:r>
+      <w:proofErr w:type="spellEnd"/>
+      <w:r>
+        <w:rPr>
+          <w:lang w:val="en-IL"/>
+        </w:rPr>
+        <w:t xml:space="preserve"> files, avoiding redundant processing times. </w:t>
       </w:r>
     </w:p>
     <w:p>
@@ -7728,7 +9818,49 @@
         <w:rPr>
           <w:lang w:val="en-IL"/>
         </w:rPr>
-        <w:t xml:space="preserve">The system processes the input track (e.g., "Seven Nation Army") by utilizing Librosa's beat_track function to extract the global tempo (BPM) and absolute timestamps of the musical beats. Because the project tests the algorithms using simulated runner dynamics, a synthetic step vector is generated based on a nominal speed ratio (r_nom) derived from the target Steps Per Minute (SPM) relative to the song's BPM. To simulate natural human inconsistency, a stochastic variance is introduced into the step timestamps using a normal distribution. A standard deviation parameter of 0.05 is applied relative to the duration between steps, ensuring the algorithm must handle realistic temporal fluctuations rather than a perfectly rigid grid. </w:t>
+        <w:t xml:space="preserve">The system processes the input track (e.g., "Seven Nation Army") by utilizing </w:t>
+      </w:r>
+      <w:proofErr w:type="spellStart"/>
+      <w:r>
+        <w:rPr>
+          <w:lang w:val="en-IL"/>
+        </w:rPr>
+        <w:t>Librosa's</w:t>
+      </w:r>
+      <w:proofErr w:type="spellEnd"/>
+      <w:r>
+        <w:rPr>
+          <w:lang w:val="en-IL"/>
+        </w:rPr>
+        <w:t xml:space="preserve"> </w:t>
+      </w:r>
+      <w:proofErr w:type="spellStart"/>
+      <w:r>
+        <w:rPr>
+          <w:lang w:val="en-IL"/>
+        </w:rPr>
+        <w:t>beat_track</w:t>
+      </w:r>
+      <w:proofErr w:type="spellEnd"/>
+      <w:r>
+        <w:rPr>
+          <w:lang w:val="en-IL"/>
+        </w:rPr>
+        <w:t xml:space="preserve"> function to extract the global tempo (BPM) and absolute timestamps of the musical beats. Because the project tests the algorithms using simulated runner dynamics, a synthetic step vector is generated based on a nominal speed ratio (</w:t>
+      </w:r>
+      <w:proofErr w:type="spellStart"/>
+      <w:r>
+        <w:rPr>
+          <w:lang w:val="en-IL"/>
+        </w:rPr>
+        <w:t>r_nom</w:t>
+      </w:r>
+      <w:proofErr w:type="spellEnd"/>
+      <w:r>
+        <w:rPr>
+          <w:lang w:val="en-IL"/>
+        </w:rPr>
+        <w:t xml:space="preserve">) derived from the target Steps Per Minute (SPM) relative to the song's BPM. To simulate natural human inconsistency, a stochastic variance is introduced into the step timestamps using a normal distribution. A standard deviation parameter of 0.05 is applied relative to the duration between steps, ensuring the algorithm must handle realistic temporal fluctuations rather than a perfectly rigid grid. </w:t>
       </w:r>
     </w:p>
     <w:p>
@@ -8171,7 +10303,71 @@
         <w:rPr>
           <w:lang w:val="en-IL"/>
         </w:rPr>
-        <w:t xml:space="preserve"> The compute_stft_custom function utilizes scipy.signal.stft with a window size (nperseg) of 2048 samples and an overlap (noverlap) of 1536 samples. </w:t>
+        <w:t xml:space="preserve"> The </w:t>
+      </w:r>
+      <w:proofErr w:type="spellStart"/>
+      <w:r>
+        <w:rPr>
+          <w:lang w:val="en-IL"/>
+        </w:rPr>
+        <w:t>compute_stft_custom</w:t>
+      </w:r>
+      <w:proofErr w:type="spellEnd"/>
+      <w:r>
+        <w:rPr>
+          <w:lang w:val="en-IL"/>
+        </w:rPr>
+        <w:t xml:space="preserve"> function utilizes </w:t>
+      </w:r>
+      <w:proofErr w:type="spellStart"/>
+      <w:proofErr w:type="gramStart"/>
+      <w:r>
+        <w:rPr>
+          <w:lang w:val="en-IL"/>
+        </w:rPr>
+        <w:t>scipy.signal</w:t>
+      </w:r>
+      <w:proofErr w:type="gramEnd"/>
+      <w:r>
+        <w:rPr>
+          <w:lang w:val="en-IL"/>
+        </w:rPr>
+        <w:t>.stft</w:t>
+      </w:r>
+      <w:proofErr w:type="spellEnd"/>
+      <w:r>
+        <w:rPr>
+          <w:lang w:val="en-IL"/>
+        </w:rPr>
+        <w:t xml:space="preserve"> with a window size (</w:t>
+      </w:r>
+      <w:proofErr w:type="spellStart"/>
+      <w:r>
+        <w:rPr>
+          <w:lang w:val="en-IL"/>
+        </w:rPr>
+        <w:t>nperseg</w:t>
+      </w:r>
+      <w:proofErr w:type="spellEnd"/>
+      <w:r>
+        <w:rPr>
+          <w:lang w:val="en-IL"/>
+        </w:rPr>
+        <w:t>) of 2048 samples and an overlap (</w:t>
+      </w:r>
+      <w:proofErr w:type="spellStart"/>
+      <w:r>
+        <w:rPr>
+          <w:lang w:val="en-IL"/>
+        </w:rPr>
+        <w:t>noverlap</w:t>
+      </w:r>
+      <w:proofErr w:type="spellEnd"/>
+      <w:r>
+        <w:rPr>
+          <w:lang w:val="en-IL"/>
+        </w:rPr>
+        <w:t xml:space="preserve">) of 1536 samples. </w:t>
       </w:r>
     </w:p>
     <w:p>
@@ -8196,7 +10392,63 @@
         <w:rPr>
           <w:lang w:val="en-IL"/>
         </w:rPr>
-        <w:t xml:space="preserve"> A standard Hann window ("hann") is applied to reduce spectral leakage, yielding an effective hop length of 512 samples (hop_length = nperseg - noverlap). </w:t>
+        <w:t xml:space="preserve"> A standard Hann window ("</w:t>
+      </w:r>
+      <w:proofErr w:type="spellStart"/>
+      <w:r>
+        <w:rPr>
+          <w:lang w:val="en-IL"/>
+        </w:rPr>
+        <w:t>hann</w:t>
+      </w:r>
+      <w:proofErr w:type="spellEnd"/>
+      <w:r>
+        <w:rPr>
+          <w:lang w:val="en-IL"/>
+        </w:rPr>
+        <w:t>") is applied to reduce spectral leakage, yielding an effective hop length of 512 samples (</w:t>
+      </w:r>
+      <w:proofErr w:type="spellStart"/>
+      <w:r>
+        <w:rPr>
+          <w:lang w:val="en-IL"/>
+        </w:rPr>
+        <w:t>hop_length</w:t>
+      </w:r>
+      <w:proofErr w:type="spellEnd"/>
+      <w:r>
+        <w:rPr>
+          <w:lang w:val="en-IL"/>
+        </w:rPr>
+        <w:t xml:space="preserve"> = </w:t>
+      </w:r>
+      <w:proofErr w:type="spellStart"/>
+      <w:r>
+        <w:rPr>
+          <w:lang w:val="en-IL"/>
+        </w:rPr>
+        <w:t>nperseg</w:t>
+      </w:r>
+      <w:proofErr w:type="spellEnd"/>
+      <w:r>
+        <w:rPr>
+          <w:lang w:val="en-IL"/>
+        </w:rPr>
+        <w:t xml:space="preserve"> - </w:t>
+      </w:r>
+      <w:proofErr w:type="spellStart"/>
+      <w:r>
+        <w:rPr>
+          <w:lang w:val="en-IL"/>
+        </w:rPr>
+        <w:t>noverlap</w:t>
+      </w:r>
+      <w:proofErr w:type="spellEnd"/>
+      <w:r>
+        <w:rPr>
+          <w:lang w:val="en-IL"/>
+        </w:rPr>
+        <w:t xml:space="preserve">). </w:t>
       </w:r>
     </w:p>
     <w:p>
@@ -8235,7 +10487,21 @@
         <w:rPr>
           <w:lang w:val="en-IL"/>
         </w:rPr>
-        <w:t xml:space="preserve">The complex STFT matrix (Zxx) is passed into a custom Harmonic-Percussive Source Separation (HPSS) module designed to isolate pitched instruments from transient drums using orthogonal filters. </w:t>
+        <w:t>The complex STFT matrix (</w:t>
+      </w:r>
+      <w:proofErr w:type="spellStart"/>
+      <w:r>
+        <w:rPr>
+          <w:lang w:val="en-IL"/>
+        </w:rPr>
+        <w:t>Zxx</w:t>
+      </w:r>
+      <w:proofErr w:type="spellEnd"/>
+      <w:r>
+        <w:rPr>
+          <w:lang w:val="en-IL"/>
+        </w:rPr>
+        <w:t xml:space="preserve">) is passed into a custom Harmonic-Percussive Source Separation (HPSS) module designed to isolate pitched instruments from transient drums using orthogonal filters. </w:t>
       </w:r>
     </w:p>
     <w:p>
@@ -8261,7 +10527,35 @@
         <w:rPr>
           <w:lang w:val="en-IL"/>
         </w:rPr>
-        <w:t xml:space="preserve"> The algorithm computes the magnitude of the spectrogram and applies a 1D median filter along the temporal axis to smooth the harmonic content (size=(1, 31)) and along the frequency axis to smooth the percussive content (size=(31, 1)). </w:t>
+        <w:t xml:space="preserve"> The algorithm computes the magnitude of the spectrogram and applies a 1D median filter along the temporal axis to smooth the harmonic content (size</w:t>
+      </w:r>
+      <w:proofErr w:type="gramStart"/>
+      <w:r>
+        <w:rPr>
+          <w:lang w:val="en-IL"/>
+        </w:rPr>
+        <w:t>=(</w:t>
+      </w:r>
+      <w:proofErr w:type="gramEnd"/>
+      <w:r>
+        <w:rPr>
+          <w:lang w:val="en-IL"/>
+        </w:rPr>
+        <w:t>1, 31)) and along the frequency axis to smooth the percussive content (size</w:t>
+      </w:r>
+      <w:proofErr w:type="gramStart"/>
+      <w:r>
+        <w:rPr>
+          <w:lang w:val="en-IL"/>
+        </w:rPr>
+        <w:t>=(</w:t>
+      </w:r>
+      <w:proofErr w:type="gramEnd"/>
+      <w:r>
+        <w:rPr>
+          <w:lang w:val="en-IL"/>
+        </w:rPr>
+        <w:t xml:space="preserve">31, 1)). </w:t>
       </w:r>
     </w:p>
     <w:p>
@@ -8294,7 +10588,49 @@
         <w:rPr>
           <w:lang w:val="en-IL"/>
         </w:rPr>
-        <w:t xml:space="preserve"> Soft masks are generated to separate the signals without introducing harsh numerical cutoffs. The masks are calculated using a power coefficient of 2.0 and a separation margin of 1.2 to enforce strict isolation between the matrices. For example, the harmonic mask formula is computed as (harm_smooth ** power) / ((harm_smooth ** power) + ((margin * perc_smooth) ** power) + eps). </w:t>
+        <w:t xml:space="preserve"> Soft masks are generated to separate the signals without introducing harsh numerical cutoffs. The masks are calculated using a power coefficient of 2.0 and a separation margin of 1.2 to enforce strict isolation between the matrices. For example, the harmonic mask formula is computed as (</w:t>
+      </w:r>
+      <w:proofErr w:type="spellStart"/>
+      <w:r>
+        <w:rPr>
+          <w:lang w:val="en-IL"/>
+        </w:rPr>
+        <w:t>harm_smooth</w:t>
+      </w:r>
+      <w:proofErr w:type="spellEnd"/>
+      <w:r>
+        <w:rPr>
+          <w:lang w:val="en-IL"/>
+        </w:rPr>
+        <w:t xml:space="preserve"> ** power) / ((</w:t>
+      </w:r>
+      <w:proofErr w:type="spellStart"/>
+      <w:r>
+        <w:rPr>
+          <w:lang w:val="en-IL"/>
+        </w:rPr>
+        <w:t>harm_smooth</w:t>
+      </w:r>
+      <w:proofErr w:type="spellEnd"/>
+      <w:r>
+        <w:rPr>
+          <w:lang w:val="en-IL"/>
+        </w:rPr>
+        <w:t xml:space="preserve"> ** power) + ((margin * </w:t>
+      </w:r>
+      <w:proofErr w:type="spellStart"/>
+      <w:r>
+        <w:rPr>
+          <w:lang w:val="en-IL"/>
+        </w:rPr>
+        <w:t>perc_smooth</w:t>
+      </w:r>
+      <w:proofErr w:type="spellEnd"/>
+      <w:r>
+        <w:rPr>
+          <w:lang w:val="en-IL"/>
+        </w:rPr>
+        <w:t xml:space="preserve">) ** power) + eps). </w:t>
       </w:r>
     </w:p>
     <w:p>
@@ -8326,7 +10662,35 @@
         <w:rPr>
           <w:lang w:val="en-IL"/>
         </w:rPr>
-        <w:t xml:space="preserve"> To ensure no audio information is lost during the split, a residual mask is computed by subtracting the harmonic and percussive masks from 1.0 (1.0 - (harm_mask + perc_mask)), clipped cleanly between 0.0 and 1.0. The original complex STFT is then multiplied by these three masks, resulting in three distinct sub-spectrograms: Harmonic, Percussive, and Residual. </w:t>
+        <w:t xml:space="preserve"> To ensure no audio information is lost during the split, a residual mask is computed by subtracting the harmonic and percussive masks from 1.0 (1.0 - (</w:t>
+      </w:r>
+      <w:proofErr w:type="spellStart"/>
+      <w:r>
+        <w:rPr>
+          <w:lang w:val="en-IL"/>
+        </w:rPr>
+        <w:t>harm_mask</w:t>
+      </w:r>
+      <w:proofErr w:type="spellEnd"/>
+      <w:r>
+        <w:rPr>
+          <w:lang w:val="en-IL"/>
+        </w:rPr>
+        <w:t xml:space="preserve"> + </w:t>
+      </w:r>
+      <w:proofErr w:type="spellStart"/>
+      <w:r>
+        <w:rPr>
+          <w:lang w:val="en-IL"/>
+        </w:rPr>
+        <w:t>perc_mask</w:t>
+      </w:r>
+      <w:proofErr w:type="spellEnd"/>
+      <w:r>
+        <w:rPr>
+          <w:lang w:val="en-IL"/>
+        </w:rPr>
+        <w:t xml:space="preserve">)), clipped cleanly between 0.0 and 1.0. The original complex STFT is then multiplied by these three masks, resulting in three distinct sub-spectrograms: Harmonic, Percussive, and Residual. </w:t>
       </w:r>
     </w:p>
     <w:p>
@@ -8434,7 +10798,21 @@
         <w:rPr>
           <w:lang w:val="en-IL"/>
         </w:rPr>
-        <w:t xml:space="preserve">The custom_phase_vocoder engine processes the Harmonic and Residual spectrogram matrices. Because stretching frequency bins alters their natural oscillation cycles, phase coherence must be manually recalculated to prevent severe warbling artifacts. </w:t>
+        <w:t xml:space="preserve">The </w:t>
+      </w:r>
+      <w:proofErr w:type="spellStart"/>
+      <w:r>
+        <w:rPr>
+          <w:lang w:val="en-IL"/>
+        </w:rPr>
+        <w:t>custom_phase_vocoder</w:t>
+      </w:r>
+      <w:proofErr w:type="spellEnd"/>
+      <w:r>
+        <w:rPr>
+          <w:lang w:val="en-IL"/>
+        </w:rPr>
+        <w:t xml:space="preserve"> engine processes the Harmonic and Residual spectrogram matrices. Because stretching frequency bins alters their natural oscillation cycles, phase coherence must be manually recalculated to prevent severe warbling artifacts. </w:t>
       </w:r>
     </w:p>
     <w:p>
@@ -8491,7 +10869,77 @@
         <w:rPr>
           <w:lang w:val="en-IL"/>
         </w:rPr>
-        <w:t xml:space="preserve"> A global phase advance vector is computed as phi_advance = 2 * np.pi * k * hop_length / n_fft. For every frequency bin, the phase delta (dp) between the surrounding original frames is extracted, normalized, and wrapped strictly between </w:t>
+        <w:t xml:space="preserve"> A global phase advance vector is computed as </w:t>
+      </w:r>
+      <w:proofErr w:type="spellStart"/>
+      <w:r>
+        <w:rPr>
+          <w:lang w:val="en-IL"/>
+        </w:rPr>
+        <w:t>phi_advance</w:t>
+      </w:r>
+      <w:proofErr w:type="spellEnd"/>
+      <w:r>
+        <w:rPr>
+          <w:lang w:val="en-IL"/>
+        </w:rPr>
+        <w:t xml:space="preserve"> = 2 * </w:t>
+      </w:r>
+      <w:proofErr w:type="spellStart"/>
+      <w:r>
+        <w:rPr>
+          <w:lang w:val="en-IL"/>
+        </w:rPr>
+        <w:t>np.pi</w:t>
+      </w:r>
+      <w:proofErr w:type="spellEnd"/>
+      <w:r>
+        <w:rPr>
+          <w:lang w:val="en-IL"/>
+        </w:rPr>
+        <w:t xml:space="preserve"> * k * </w:t>
+      </w:r>
+      <w:proofErr w:type="spellStart"/>
+      <w:r>
+        <w:rPr>
+          <w:lang w:val="en-IL"/>
+        </w:rPr>
+        <w:t>hop_length</w:t>
+      </w:r>
+      <w:proofErr w:type="spellEnd"/>
+      <w:r>
+        <w:rPr>
+          <w:lang w:val="en-IL"/>
+        </w:rPr>
+        <w:t xml:space="preserve"> / </w:t>
+      </w:r>
+      <w:proofErr w:type="spellStart"/>
+      <w:r>
+        <w:rPr>
+          <w:lang w:val="en-IL"/>
+        </w:rPr>
+        <w:t>n_fft</w:t>
+      </w:r>
+      <w:proofErr w:type="spellEnd"/>
+      <w:r>
+        <w:rPr>
+          <w:lang w:val="en-IL"/>
+        </w:rPr>
+        <w:t>. For every frequency bin, the phase delta (</w:t>
+      </w:r>
+      <w:proofErr w:type="spellStart"/>
+      <w:r>
+        <w:rPr>
+          <w:lang w:val="en-IL"/>
+        </w:rPr>
+        <w:t>dp</w:t>
+      </w:r>
+      <w:proofErr w:type="spellEnd"/>
+      <w:r>
+        <w:rPr>
+          <w:lang w:val="en-IL"/>
+        </w:rPr>
+        <w:t xml:space="preserve">) between the surrounding original frames is extracted, normalized, and wrapped strictly between </w:t>
       </w:r>
       <m:oMath>
         <m:r>
@@ -8521,7 +10969,21 @@
         <w:rPr>
           <w:lang w:val="en-IL"/>
         </w:rPr>
-        <w:t xml:space="preserve"> using the arithmetic logic dp = dp - 2 * np.pi * np.round(dp / (2 * np.pi)). The true phase is then accumulated into the ongoing current_phase state, which is merged with the interpolated magnitude array to reconstruct the modified complex spectrogram. </w:t>
+        <w:t xml:space="preserve"> using the arithmetic logic dp = dp - 2 * np.pi * </w:t>
+      </w:r>
+      <w:proofErr w:type="gramStart"/>
+      <w:r>
+        <w:rPr>
+          <w:lang w:val="en-IL"/>
+        </w:rPr>
+        <w:t>np.round</w:t>
+      </w:r>
+      <w:proofErr w:type="gramEnd"/>
+      <w:r>
+        <w:rPr>
+          <w:lang w:val="en-IL"/>
+        </w:rPr>
+        <w:t xml:space="preserve">(dp / (2 * np.pi)). The true phase is then accumulated into the ongoing current_phase state, which is merged with the interpolated magnitude array to reconstruct the modified complex spectrogram. </w:t>
       </w:r>
     </w:p>
     <w:p>
@@ -8563,7 +11025,21 @@
         <w:rPr>
           <w:lang w:val="en-IL"/>
         </w:rPr>
-        <w:t xml:space="preserve">The custom_wsola (Waveform Similarity Overlap-Add) engine directly manipulates the Percussive time-domain signal. Because drums contain sharp transients, processing them in the frequency domain causes "smearing"; WSOLA avoids this by keeping the waveform intact and carefully overlapping segments. </w:t>
+        <w:t xml:space="preserve">The </w:t>
+      </w:r>
+      <w:proofErr w:type="spellStart"/>
+      <w:r>
+        <w:rPr>
+          <w:lang w:val="en-IL"/>
+        </w:rPr>
+        <w:t>custom_wsola</w:t>
+      </w:r>
+      <w:proofErr w:type="spellEnd"/>
+      <w:r>
+        <w:rPr>
+          <w:lang w:val="en-IL"/>
+        </w:rPr>
+        <w:t xml:space="preserve"> (Waveform Similarity Overlap-Add) engine directly manipulates the Percussive time-domain signal. Because drums contain sharp transients, processing them in the frequency domain causes "smearing"; WSOLA avoids this by keeping the waveform intact and carefully overlapping segments. </w:t>
       </w:r>
     </w:p>
     <w:p>
@@ -8613,7 +11089,137 @@
         <w:rPr>
           <w:lang w:val="en-IL"/>
         </w:rPr>
-        <w:t xml:space="preserve"> The engine uses a predefined synthesis hop size (syn_hop = 512) and an analysis window size (win_size = 2048). Rather than strictly pasting audio at the target analysis hop point (ana_hop = int(syn_hop * rate)), the algorithm extracts a localized search region constrained by a delta boundary (delta = 512). It utilizes scipy.signal.correlate (in valid mode) to slide a template of the current output against the search region, seeking the position of highest waveform similarity (best_shift = np.argmax(corr) - delta). </w:t>
+        <w:t xml:space="preserve"> The engine uses a predefined synthesis hop size (</w:t>
+      </w:r>
+      <w:proofErr w:type="spellStart"/>
+      <w:r>
+        <w:rPr>
+          <w:lang w:val="en-IL"/>
+        </w:rPr>
+        <w:t>syn_hop</w:t>
+      </w:r>
+      <w:proofErr w:type="spellEnd"/>
+      <w:r>
+        <w:rPr>
+          <w:lang w:val="en-IL"/>
+        </w:rPr>
+        <w:t xml:space="preserve"> = 512) and an analysis window size (</w:t>
+      </w:r>
+      <w:proofErr w:type="spellStart"/>
+      <w:r>
+        <w:rPr>
+          <w:lang w:val="en-IL"/>
+        </w:rPr>
+        <w:t>win_size</w:t>
+      </w:r>
+      <w:proofErr w:type="spellEnd"/>
+      <w:r>
+        <w:rPr>
+          <w:lang w:val="en-IL"/>
+        </w:rPr>
+        <w:t xml:space="preserve"> = 2048). Rather than strictly pasting audio at the target analysis hop point (</w:t>
+      </w:r>
+      <w:proofErr w:type="spellStart"/>
+      <w:r>
+        <w:rPr>
+          <w:lang w:val="en-IL"/>
+        </w:rPr>
+        <w:t>ana_hop</w:t>
+      </w:r>
+      <w:proofErr w:type="spellEnd"/>
+      <w:r>
+        <w:rPr>
+          <w:lang w:val="en-IL"/>
+        </w:rPr>
+        <w:t xml:space="preserve"> = </w:t>
+      </w:r>
+      <w:proofErr w:type="gramStart"/>
+      <w:r>
+        <w:rPr>
+          <w:lang w:val="en-IL"/>
+        </w:rPr>
+        <w:t>int(</w:t>
+      </w:r>
+      <w:proofErr w:type="spellStart"/>
+      <w:proofErr w:type="gramEnd"/>
+      <w:r>
+        <w:rPr>
+          <w:lang w:val="en-IL"/>
+        </w:rPr>
+        <w:t>syn_hop</w:t>
+      </w:r>
+      <w:proofErr w:type="spellEnd"/>
+      <w:r>
+        <w:rPr>
+          <w:lang w:val="en-IL"/>
+        </w:rPr>
+        <w:t xml:space="preserve"> * rate)), the algorithm extracts a localized search region constrained by a delta boundary (delta = 512). It utilizes </w:t>
+      </w:r>
+      <w:proofErr w:type="spellStart"/>
+      <w:proofErr w:type="gramStart"/>
+      <w:r>
+        <w:rPr>
+          <w:lang w:val="en-IL"/>
+        </w:rPr>
+        <w:t>scipy.signal</w:t>
+      </w:r>
+      <w:proofErr w:type="gramEnd"/>
+      <w:r>
+        <w:rPr>
+          <w:lang w:val="en-IL"/>
+        </w:rPr>
+        <w:t>.correlate</w:t>
+      </w:r>
+      <w:proofErr w:type="spellEnd"/>
+      <w:r>
+        <w:rPr>
+          <w:lang w:val="en-IL"/>
+        </w:rPr>
+        <w:t xml:space="preserve"> (in valid mode) to slide a template of the current output against the search region, seeking the position of highest waveform similarity (</w:t>
+      </w:r>
+      <w:proofErr w:type="spellStart"/>
+      <w:r>
+        <w:rPr>
+          <w:lang w:val="en-IL"/>
+        </w:rPr>
+        <w:t>best_shift</w:t>
+      </w:r>
+      <w:proofErr w:type="spellEnd"/>
+      <w:r>
+        <w:rPr>
+          <w:lang w:val="en-IL"/>
+        </w:rPr>
+        <w:t xml:space="preserve"> = </w:t>
+      </w:r>
+      <w:proofErr w:type="spellStart"/>
+      <w:proofErr w:type="gramStart"/>
+      <w:r>
+        <w:rPr>
+          <w:lang w:val="en-IL"/>
+        </w:rPr>
+        <w:t>np.argmax</w:t>
+      </w:r>
+      <w:proofErr w:type="spellEnd"/>
+      <w:proofErr w:type="gramEnd"/>
+      <w:r>
+        <w:rPr>
+          <w:lang w:val="en-IL"/>
+        </w:rPr>
+        <w:t>(</w:t>
+      </w:r>
+      <w:proofErr w:type="spellStart"/>
+      <w:r>
+        <w:rPr>
+          <w:lang w:val="en-IL"/>
+        </w:rPr>
+        <w:t>corr</w:t>
+      </w:r>
+      <w:proofErr w:type="spellEnd"/>
+      <w:r>
+        <w:rPr>
+          <w:lang w:val="en-IL"/>
+        </w:rPr>
+        <w:t xml:space="preserve">) - delta). </w:t>
       </w:r>
     </w:p>
     <w:p>
@@ -8638,7 +11244,37 @@
         <w:rPr>
           <w:lang w:val="en-IL"/>
         </w:rPr>
-        <w:t xml:space="preserve"> The optimally aligned waveform segment is scaled by a Hanning window (w = np.hanning(win_size)) to crossfade the boundaries and is added into the output array. </w:t>
+        <w:t xml:space="preserve"> The optimally aligned waveform segment is scaled by a Hanning window (w = </w:t>
+      </w:r>
+      <w:proofErr w:type="spellStart"/>
+      <w:proofErr w:type="gramStart"/>
+      <w:r>
+        <w:rPr>
+          <w:lang w:val="en-IL"/>
+        </w:rPr>
+        <w:t>np.hanning</w:t>
+      </w:r>
+      <w:proofErr w:type="spellEnd"/>
+      <w:proofErr w:type="gramEnd"/>
+      <w:r>
+        <w:rPr>
+          <w:lang w:val="en-IL"/>
+        </w:rPr>
+        <w:t>(</w:t>
+      </w:r>
+      <w:proofErr w:type="spellStart"/>
+      <w:r>
+        <w:rPr>
+          <w:lang w:val="en-IL"/>
+        </w:rPr>
+        <w:t>win_size</w:t>
+      </w:r>
+      <w:proofErr w:type="spellEnd"/>
+      <w:r>
+        <w:rPr>
+          <w:lang w:val="en-IL"/>
+        </w:rPr>
+        <w:t xml:space="preserve">)) to crossfade the boundaries and is added into the output array. </w:t>
       </w:r>
     </w:p>
     <w:p>
@@ -8672,27 +11308,105 @@
         <w:rPr>
           <w:lang w:val="en-IL"/>
         </w:rPr>
-        <w:t xml:space="preserve">Following the independent stretching processes, the Harmonic and Residual matrices are reverted to the time domain using an Inverse STFT (istft) via the </w:t>
-      </w:r>
+        <w:t>Following the independent stretching processes, the Harmonic and Residual matrices are reverted to the time domain using an Inverse STFT (</w:t>
+      </w:r>
+      <w:proofErr w:type="spellStart"/>
+      <w:r>
+        <w:rPr>
+          <w:lang w:val="en-IL"/>
+        </w:rPr>
+        <w:t>istft</w:t>
+      </w:r>
+      <w:proofErr w:type="spellEnd"/>
+      <w:r>
+        <w:rPr>
+          <w:lang w:val="en-IL"/>
+        </w:rPr>
+        <w:t xml:space="preserve">) via the </w:t>
+      </w:r>
+      <w:proofErr w:type="spellStart"/>
       <w:r>
         <w:rPr>
           <w:lang w:val="en-IL"/>
         </w:rPr>
         <w:lastRenderedPageBreak/>
-        <w:t xml:space="preserve">reconstruct_signal_custom function. To finalize the chunk, the algorithm trims the arrays to the shortest minimum length (min_len) to prevent dimension-mismatch errors and algebraically sums the separated harmonic, percussive, and residual audio arrays together. </w:t>
-      </w:r>
-    </w:p>
-    <w:p>
-      <w:pPr>
-        <w:rPr>
-          <w:lang w:val="en-IL"/>
-        </w:rPr>
-      </w:pPr>
-      <w:r>
-        <w:rPr>
-          <w:lang w:val="en-IL"/>
-        </w:rPr>
-        <w:t xml:space="preserve">The completed chunks are aggregated sequentially. Once the entire song has been processed and compiled into final_song, the system applies a click track mapping directly to the runner's simulated steps via the add_clicks utility—overlaying exponential decay click envelopes directly onto the output file. The final dynamic synchronized audio is exported via the Soundfile library to a .wav file, providing a complete, seamless representation of the pre-processed runner synchronization pipeline. </w:t>
+        <w:t>reconstruct_signal_custom</w:t>
+      </w:r>
+      <w:proofErr w:type="spellEnd"/>
+      <w:r>
+        <w:rPr>
+          <w:lang w:val="en-IL"/>
+        </w:rPr>
+        <w:t xml:space="preserve"> function. To finalize the chunk, the algorithm trims the arrays to the shortest minimum length (</w:t>
+      </w:r>
+      <w:proofErr w:type="spellStart"/>
+      <w:r>
+        <w:rPr>
+          <w:lang w:val="en-IL"/>
+        </w:rPr>
+        <w:t>min_len</w:t>
+      </w:r>
+      <w:proofErr w:type="spellEnd"/>
+      <w:r>
+        <w:rPr>
+          <w:lang w:val="en-IL"/>
+        </w:rPr>
+        <w:t xml:space="preserve">) to prevent dimension-mismatch errors and algebraically sums the separated harmonic, percussive, and residual audio arrays together. </w:t>
+      </w:r>
+    </w:p>
+    <w:p>
+      <w:pPr>
+        <w:rPr>
+          <w:lang w:val="en-IL"/>
+        </w:rPr>
+      </w:pPr>
+      <w:r>
+        <w:rPr>
+          <w:lang w:val="en-IL"/>
+        </w:rPr>
+        <w:t xml:space="preserve">The completed chunks are aggregated sequentially. Once the entire song has been processed and compiled into </w:t>
+      </w:r>
+      <w:proofErr w:type="spellStart"/>
+      <w:r>
+        <w:rPr>
+          <w:lang w:val="en-IL"/>
+        </w:rPr>
+        <w:t>final_song</w:t>
+      </w:r>
+      <w:proofErr w:type="spellEnd"/>
+      <w:r>
+        <w:rPr>
+          <w:lang w:val="en-IL"/>
+        </w:rPr>
+        <w:t xml:space="preserve">, the system applies a click track mapping directly to the runner's simulated steps via the </w:t>
+      </w:r>
+      <w:proofErr w:type="spellStart"/>
+      <w:r>
+        <w:rPr>
+          <w:lang w:val="en-IL"/>
+        </w:rPr>
+        <w:t>add_clicks</w:t>
+      </w:r>
+      <w:proofErr w:type="spellEnd"/>
+      <w:r>
+        <w:rPr>
+          <w:lang w:val="en-IL"/>
+        </w:rPr>
+        <w:t xml:space="preserve"> utility—overlaying exponential decay click envelopes directly onto the output file. The final dynamic synchronized audio is exported via the </w:t>
+      </w:r>
+      <w:proofErr w:type="spellStart"/>
+      <w:r>
+        <w:rPr>
+          <w:lang w:val="en-IL"/>
+        </w:rPr>
+        <w:t>Soundfile</w:t>
+      </w:r>
+      <w:proofErr w:type="spellEnd"/>
+      <w:r>
+        <w:rPr>
+          <w:lang w:val="en-IL"/>
+        </w:rPr>
+        <w:t xml:space="preserve"> library to a .wav file, providing a complete, seamless representation of the pre-processed runner synchronization pipeline. </w:t>
       </w:r>
     </w:p>
     <w:p>
@@ -9233,7 +11947,23 @@
         </w:rPr>
       </w:pPr>
       <w:r>
-        <w:t>G. B. Giannakis , "Highlights of Signal Processing for Communications",  IEEE Signal Processing Magazine, Vol. 16, no 2, pp. 14-49, March 1999</w:t>
+        <w:t xml:space="preserve">G. B. </w:t>
+      </w:r>
+      <w:proofErr w:type="gramStart"/>
+      <w:r>
+        <w:t>Giannakis ,</w:t>
+      </w:r>
+      <w:proofErr w:type="gramEnd"/>
+      <w:r>
+        <w:t xml:space="preserve"> "Highlights of Signal Processing for Communications</w:t>
+      </w:r>
+      <w:proofErr w:type="gramStart"/>
+      <w:r>
+        <w:t>",  IEEE</w:t>
+      </w:r>
+      <w:proofErr w:type="gramEnd"/>
+      <w:r>
+        <w:t xml:space="preserve"> Signal Processing Magazine, Vol. 16, no 2, pp. 14-49, March 1999</w:t>
       </w:r>
     </w:p>
     <w:p>
@@ -9250,7 +11980,15 @@
         </w:numPr>
       </w:pPr>
       <w:r>
-        <w:t xml:space="preserve">“Spartan-3A DSP FPGA Family Data Sheet”, XILINX Product Specification DS610,   October 4, 2010. </w:t>
+        <w:t>“Spartan-3A DSP FPGA Family Data Sheet”, XILINX Product Specification DS</w:t>
+      </w:r>
+      <w:proofErr w:type="gramStart"/>
+      <w:r>
+        <w:t xml:space="preserve">610,   </w:t>
+      </w:r>
+      <w:proofErr w:type="gramEnd"/>
+      <w:r>
+        <w:t xml:space="preserve">October 4, 2010. </w:t>
       </w:r>
       <w:hyperlink r:id="rId11" w:history="1">
         <w:r>
@@ -9268,7 +12006,11 @@
     </w:p>
     <w:p>
       <w:r>
-        <w:t xml:space="preserve">Application Note </w:t>
+        <w:t xml:space="preserve">Application </w:t>
+      </w:r>
+      <w:proofErr w:type="gramStart"/>
+      <w:r>
+        <w:t xml:space="preserve">Note </w:t>
       </w:r>
       <w:r>
         <w:rPr>
@@ -9276,6 +12018,7 @@
         </w:rPr>
         <w:t>:</w:t>
       </w:r>
+      <w:proofErr w:type="gramEnd"/>
     </w:p>
     <w:p>
       <w:pPr>
@@ -9286,7 +12029,15 @@
         </w:numPr>
       </w:pPr>
       <w:r>
-        <w:t xml:space="preserve">X.  Zhang, "Developing a CCStudio 2.0 DSP/BIOS Application for FLASH Booting on the TMS320C5402 DSK", TI Application Report SPRA661A, November 2000. </w:t>
+        <w:t xml:space="preserve">X.  Zhang, "Developing a </w:t>
+      </w:r>
+      <w:proofErr w:type="spellStart"/>
+      <w:r>
+        <w:t>CCStudio</w:t>
+      </w:r>
+      <w:proofErr w:type="spellEnd"/>
+      <w:r>
+        <w:t xml:space="preserve"> 2.0 DSP/BIOS Application for FLASH Booting on the TMS320C5402 DSK", TI Application Report SPRA661A, November 2000. </w:t>
       </w:r>
       <w:hyperlink r:id="rId12" w:history="1">
         <w:r>
@@ -9440,11 +12191,20 @@
           <w:i/>
           <w:iCs/>
         </w:rPr>
-        <w:t>The PROSIG Digital Signal Processing Tutorials</w:t>
+        <w:t xml:space="preserve">The PROSIG Digital Signal Processing </w:t>
+      </w:r>
+      <w:proofErr w:type="gramStart"/>
+      <w:r>
+        <w:rPr>
+          <w:i/>
+          <w:iCs/>
+        </w:rPr>
+        <w:t>Tutorials</w:t>
       </w:r>
       <w:r>
         <w:t xml:space="preserve">,   </w:t>
       </w:r>
+      <w:proofErr w:type="gramEnd"/>
       <w:hyperlink r:id="rId16" w:history="1">
         <w:r>
           <w:rPr>
@@ -13232,6 +15992,7 @@
   <w:style w:type="character" w:default="1" w:styleId="DefaultParagraphFont">
     <w:name w:val="Default Paragraph Font"/>
     <w:uiPriority w:val="1"/>
+    <w:semiHidden/>
     <w:unhideWhenUsed/>
   </w:style>
   <w:style w:type="table" w:default="1" w:styleId="TableNormal">

</xml_diff>